<commit_message>
Phát triển ứng dụng Web mã nguồn mở Hands-on 11 – Xây dựng giỏ hàng với PHP Session
</commit_message>
<xml_diff>
--- a/Baocao/qt_baocao_110123032_DinhHuuNhan_DA23TTA.docx
+++ b/Baocao/qt_baocao_110123032_DinhHuuNhan_DA23TTA.docx
@@ -5013,6 +5013,12 @@
             <w:insideH w:val="single" w:color="000000" w:sz="4" w:space="0"/>
             <w:insideV w:val="single" w:color="000000" w:sz="4" w:space="0"/>
           </w:tblBorders>
+          <w:tblCellMar>
+            <w:top w:w="0" w:type="dxa"/>
+            <w:left w:w="85" w:type="dxa"/>
+            <w:bottom w:w="0" w:type="dxa"/>
+            <w:right w:w="85" w:type="dxa"/>
+          </w:tblCellMar>
         </w:tblPrEx>
         <w:trPr>
           <w:cantSplit/>
@@ -8606,8 +8612,6 @@
       </w:r>
     </w:p>
     <w:p>
-      <w:bookmarkStart w:id="96" w:name="_GoBack"/>
-      <w:bookmarkEnd w:id="96"/>
       <w:r>
         <w:br w:type="page"/>
       </w:r>
@@ -9368,7 +9372,15 @@
         <w:rPr>
           <w:lang w:val="vi-VN"/>
         </w:rPr>
-        <w:t>Từ bài toán trên, đồ án xác định các nghiệp vụ cốt lõi và ánh xạ chúng vào các thực thể dữ liệu như trong Bảng 1.1.</w:t>
+        <w:t>Từ bài toán trên, đồ án xác định các ngh</w:t>
+      </w:r>
+      <w:bookmarkStart w:id="94" w:name="_GoBack"/>
+      <w:bookmarkEnd w:id="94"/>
+      <w:r>
+        <w:rPr>
+          <w:lang w:val="vi-VN"/>
+        </w:rPr>
+        <w:t>iệp vụ cốt lõi và ánh xạ chúng vào các thực thể dữ liệu như trong Bảng 1.1.</w:t>
       </w:r>
     </w:p>
     <w:p>
@@ -9589,19 +9601,6 @@
               </w:rPr>
               <w:t>Thêm, xem, sửa, xóa danh mục</w:t>
             </w:r>
-            <w:r>
-              <w:rPr>
-                <w:rFonts w:hint="default"/>
-                <w:lang w:val="en-US"/>
-              </w:rPr>
-              <w:t xml:space="preserve"> </w:t>
-            </w:r>
-            <w:r>
-              <w:rPr>
-                <w:lang w:val="vi-VN"/>
-              </w:rPr>
-              <w:t>(Hands-on 04)</w:t>
-            </w:r>
           </w:p>
         </w:tc>
       </w:tr>
@@ -9683,13 +9682,7 @@
                 <w:rFonts w:hint="default"/>
                 <w:lang w:val="en-US"/>
               </w:rPr>
-              <w:t xml:space="preserve">   </w:t>
-            </w:r>
-            <w:r>
-              <w:rPr>
-                <w:lang w:val="vi-VN"/>
-              </w:rPr>
-              <w:t>(Hands-on 05)</w:t>
+              <w:t xml:space="preserve">  </w:t>
             </w:r>
           </w:p>
         </w:tc>
@@ -9765,7 +9758,7 @@
               <w:rPr>
                 <w:lang w:val="vi-VN"/>
               </w:rPr>
-              <w:t>Tải lên 1 – 4 ảnh, đặt ảnh chính, thêm và xóa ảnh (Hands-on 06, 07)</w:t>
+              <w:t xml:space="preserve">Tải lên 1 – 4 ảnh, đặt ảnh chính, thêm và xóa ảnh </w:t>
             </w:r>
           </w:p>
         </w:tc>
@@ -9841,7 +9834,7 @@
               <w:rPr>
                 <w:lang w:val="vi-VN"/>
               </w:rPr>
-              <w:t>Danh sách, chi tiết, tìm kiếm, lọc, phân trang (Hands-on 09, 10)</w:t>
+              <w:t xml:space="preserve">Danh sách, chi tiết, tìm kiếm, lọc, phân trang </w:t>
             </w:r>
           </w:p>
         </w:tc>
@@ -9917,7 +9910,7 @@
               <w:rPr>
                 <w:lang w:val="vi-VN"/>
               </w:rPr>
-              <w:t>Giỏ hàng, Checkout, lưu đơn hàng, trừ tồn kho (Hands-on 11, 12)</w:t>
+              <w:t xml:space="preserve">Giỏ hàng, Checkout, lưu đơn hàng, trừ tồn kho </w:t>
             </w:r>
           </w:p>
         </w:tc>
@@ -9993,7 +9986,7 @@
               <w:rPr>
                 <w:lang w:val="vi-VN"/>
               </w:rPr>
-              <w:t>Xem danh sách, chi tiết, đổi trạng thái, hủy đơn và hoàn tồn kho (Hands-on 13)</w:t>
+              <w:t>Xem danh sách, chi tiết, đổi trạng thái, hủy đơn và hoàn tồn kho</w:t>
             </w:r>
           </w:p>
         </w:tc>
@@ -10069,7 +10062,7 @@
               <w:rPr>
                 <w:lang w:val="vi-VN"/>
               </w:rPr>
-              <w:t>Đăng ký, đăng nhập, đăng xuất, nhận diện khách khi đặt hàng (Hands-on 14)</w:t>
+              <w:t xml:space="preserve">Đăng ký, đăng nhập, đăng xuất, nhận diện khách khi đặt hàng </w:t>
             </w:r>
           </w:p>
         </w:tc>
@@ -10145,7 +10138,7 @@
               <w:rPr>
                 <w:lang w:val="vi-VN"/>
               </w:rPr>
-              <w:t>REST API trả JSON và giao diện Fetch API (Hands-on 15)</w:t>
+              <w:t xml:space="preserve">REST API trả JSON và giao diện Fetch API </w:t>
             </w:r>
           </w:p>
         </w:tc>
@@ -11855,10 +11848,10 @@
       </w:pPr>
       <w:r>
         <w:drawing>
-          <wp:inline distT="0" distB="0" distL="114300" distR="114300">
-            <wp:extent cx="5570855" cy="4779010"/>
-            <wp:effectExtent l="0" t="0" r="6985" b="6350"/>
-            <wp:docPr id="1" name="Picture 1"/>
+          <wp:inline distT="0" distB="0" distL="0" distR="0">
+            <wp:extent cx="4895850" cy="3182620"/>
+            <wp:effectExtent l="0" t="0" r="11430" b="2540"/>
+            <wp:docPr id="100" name="Hình 100" descr="Sơ đồ tổng quan: người dùng và quản trị viên tương tác với ba khu vực của hệ thống, hệ thống làm việc với cơ sở dữ liệu MySQL và kho ảnh thiết bị"/>
             <wp:cNvGraphicFramePr>
               <a:graphicFrameLocks xmlns:a="http://schemas.openxmlformats.org/drawingml/2006/main" noChangeAspect="1"/>
             </wp:cNvGraphicFramePr>
@@ -11866,7 +11859,7 @@
               <a:graphicData uri="http://schemas.openxmlformats.org/drawingml/2006/picture">
                 <pic:pic xmlns:pic="http://schemas.openxmlformats.org/drawingml/2006/picture">
                   <pic:nvPicPr>
-                    <pic:cNvPr id="1" name="Picture 1"/>
+                    <pic:cNvPr id="100" name="Hình 100" descr="Sơ đồ tổng quan: người dùng và quản trị viên tương tác với ba khu vực của hệ thống, hệ thống làm việc với cơ sở dữ liệu MySQL và kho ảnh thiết bị"/>
                     <pic:cNvPicPr>
                       <a:picLocks noChangeAspect="1"/>
                     </pic:cNvPicPr>
@@ -11880,15 +11873,11 @@
                   <pic:spPr>
                     <a:xfrm>
                       <a:off x="0" y="0"/>
-                      <a:ext cx="5570855" cy="4779010"/>
+                      <a:ext cx="4896000" cy="3182753"/>
                     </a:xfrm>
                     <a:prstGeom prst="rect">
                       <a:avLst/>
                     </a:prstGeom>
-                    <a:noFill/>
-                    <a:ln>
-                      <a:noFill/>
-                    </a:ln>
                   </pic:spPr>
                 </pic:pic>
               </a:graphicData>
@@ -11896,63 +11885,6 @@
           </wp:inline>
         </w:drawing>
       </w:r>
-      <w:r>
-        <w:rPr>
-          <w:lang w:val="vi-VN"/>
-        </w:rPr>
-        <w:t>Hình 1.</w:t>
-      </w:r>
-      <w:r>
-        <w:fldChar w:fldCharType="begin"/>
-      </w:r>
-      <w:r>
-        <w:instrText xml:space="preserve"> SEQ Hình \r 1 </w:instrText>
-      </w:r>
-      <w:r>
-        <w:fldChar w:fldCharType="separate"/>
-      </w:r>
-      <w:r>
-        <w:rPr>
-          <w:lang w:val="vi-VN"/>
-        </w:rPr>
-        <w:t>1</w:t>
-      </w:r>
-      <w:r>
-        <w:fldChar w:fldCharType="end"/>
-      </w:r>
-      <w:bookmarkStart w:id="15" w:name="_Toc7140"/>
-      <w:r>
-        <w:rPr>
-          <w:lang w:val="vi-VN"/>
-        </w:rPr>
-        <w:t>. Sơ đồ tổng quan kiến trúc hệ thống</w:t>
-      </w:r>
-      <w:bookmarkEnd w:id="15"/>
-    </w:p>
-    <w:p>
-      <w:pPr>
-        <w:pStyle w:val="3"/>
-      </w:pPr>
-      <w:bookmarkStart w:id="16" w:name="_Toc21231"/>
-      <w:r>
-        <w:rPr>
-          <w:lang w:val="vi-VN"/>
-        </w:rPr>
-        <w:t>Lộ trình thực hiện đồ án</w:t>
-      </w:r>
-      <w:bookmarkEnd w:id="16"/>
-    </w:p>
-    <w:p>
-      <w:pPr>
-        <w:ind w:firstLine="567"/>
-        <w:jc w:val="both"/>
-      </w:pPr>
-      <w:r>
-        <w:rPr>
-          <w:lang w:val="vi-VN"/>
-        </w:rPr>
-        <w:t>Đồ án được thực hiện theo nguyên tắc phát triển tăng dần: mỗi bài Hands-on kế thừa kết quả của bài trước, chỉ sửa hoặc bổ sung phần cần thiết và kết thúc bằng một checkpoint lưu trên GitHub. Lộ trình tổng thể được trình bày trong Bảng 1.3.</w:t>
-      </w:r>
     </w:p>
     <w:p>
       <w:pPr>
@@ -11963,13 +11895,13 @@
         <w:rPr>
           <w:lang w:val="vi-VN"/>
         </w:rPr>
-        <w:t>Bảng 1.</w:t>
+        <w:t>Hình 1.</w:t>
       </w:r>
       <w:r>
         <w:fldChar w:fldCharType="begin"/>
       </w:r>
       <w:r>
-        <w:instrText xml:space="preserve"> SEQ Bảng </w:instrText>
+        <w:instrText xml:space="preserve"> SEQ Hình \r 1 </w:instrText>
       </w:r>
       <w:r>
         <w:fldChar w:fldCharType="separate"/>
@@ -11978,1532 +11910,20 @@
         <w:rPr>
           <w:lang w:val="vi-VN"/>
         </w:rPr>
-        <w:t>3</w:t>
+        <w:t>1</w:t>
       </w:r>
       <w:r>
         <w:fldChar w:fldCharType="end"/>
       </w:r>
-      <w:bookmarkStart w:id="17" w:name="_Toc14837"/>
-      <w:r>
-        <w:rPr>
-          <w:lang w:val="vi-VN"/>
-        </w:rPr>
-        <w:t>. Lộ trình thực hiện đồ án theo các bài Pre-lab và Hands-on</w:t>
-      </w:r>
-      <w:bookmarkEnd w:id="17"/>
-    </w:p>
-    <w:tbl>
-      <w:tblPr>
-        <w:tblStyle w:val="12"/>
-        <w:tblW w:w="8788" w:type="dxa"/>
-        <w:jc w:val="center"/>
-        <w:tblBorders>
-          <w:top w:val="single" w:color="000000" w:sz="4" w:space="0"/>
-          <w:left w:val="single" w:color="000000" w:sz="4" w:space="0"/>
-          <w:bottom w:val="single" w:color="000000" w:sz="4" w:space="0"/>
-          <w:right w:val="single" w:color="000000" w:sz="4" w:space="0"/>
-          <w:insideH w:val="single" w:color="000000" w:sz="4" w:space="0"/>
-          <w:insideV w:val="single" w:color="000000" w:sz="4" w:space="0"/>
-        </w:tblBorders>
-        <w:tblLayout w:type="fixed"/>
-        <w:tblCellMar>
-          <w:top w:w="0" w:type="dxa"/>
-          <w:left w:w="85" w:type="dxa"/>
-          <w:bottom w:w="0" w:type="dxa"/>
-          <w:right w:w="85" w:type="dxa"/>
-        </w:tblCellMar>
-      </w:tblPr>
-      <w:tblGrid>
-        <w:gridCol w:w="1516"/>
-        <w:gridCol w:w="2702"/>
-        <w:gridCol w:w="4570"/>
-      </w:tblGrid>
-      <w:tr>
-        <w:tblPrEx>
-          <w:tblBorders>
-            <w:top w:val="single" w:color="000000" w:sz="4" w:space="0"/>
-            <w:left w:val="single" w:color="000000" w:sz="4" w:space="0"/>
-            <w:bottom w:val="single" w:color="000000" w:sz="4" w:space="0"/>
-            <w:right w:val="single" w:color="000000" w:sz="4" w:space="0"/>
-            <w:insideH w:val="single" w:color="000000" w:sz="4" w:space="0"/>
-            <w:insideV w:val="single" w:color="000000" w:sz="4" w:space="0"/>
-          </w:tblBorders>
-        </w:tblPrEx>
-        <w:trPr>
-          <w:cantSplit/>
-          <w:tblHeader/>
-          <w:jc w:val="center"/>
-        </w:trPr>
-        <w:tc>
-          <w:tcPr>
-            <w:tcW w:w="1516" w:type="dxa"/>
-            <w:shd w:val="clear" w:color="auto" w:fill="FFFFFF" w:themeFill="background1"/>
-            <w:vAlign w:val="center"/>
-          </w:tcPr>
-          <w:p>
-            <w:pPr>
-              <w:pStyle w:val="33"/>
-              <w:bidi w:val="0"/>
-            </w:pPr>
-            <w:r>
-              <w:rPr>
-                <w:lang w:val="vi-VN"/>
-              </w:rPr>
-              <w:t>Bài</w:t>
-            </w:r>
-          </w:p>
-        </w:tc>
-        <w:tc>
-          <w:tcPr>
-            <w:tcW w:w="2702" w:type="dxa"/>
-            <w:shd w:val="clear" w:color="auto" w:fill="FFFFFF" w:themeFill="background1"/>
-            <w:vAlign w:val="center"/>
-          </w:tcPr>
-          <w:p>
-            <w:pPr>
-              <w:pStyle w:val="33"/>
-              <w:bidi w:val="0"/>
-            </w:pPr>
-            <w:r>
-              <w:rPr>
-                <w:lang w:val="vi-VN"/>
-              </w:rPr>
-              <w:t>Nội dung</w:t>
-            </w:r>
-          </w:p>
-        </w:tc>
-        <w:tc>
-          <w:tcPr>
-            <w:tcW w:w="4570" w:type="dxa"/>
-            <w:shd w:val="clear" w:color="auto" w:fill="FFFFFF" w:themeFill="background1"/>
-            <w:vAlign w:val="center"/>
-          </w:tcPr>
-          <w:p>
-            <w:pPr>
-              <w:pStyle w:val="33"/>
-              <w:bidi w:val="0"/>
-            </w:pPr>
-            <w:r>
-              <w:rPr>
-                <w:lang w:val="vi-VN"/>
-              </w:rPr>
-              <w:t>Kết quả chính</w:t>
-            </w:r>
-          </w:p>
-        </w:tc>
-      </w:tr>
-      <w:tr>
-        <w:tblPrEx>
-          <w:tblBorders>
-            <w:top w:val="single" w:color="000000" w:sz="4" w:space="0"/>
-            <w:left w:val="single" w:color="000000" w:sz="4" w:space="0"/>
-            <w:bottom w:val="single" w:color="000000" w:sz="4" w:space="0"/>
-            <w:right w:val="single" w:color="000000" w:sz="4" w:space="0"/>
-            <w:insideH w:val="single" w:color="000000" w:sz="4" w:space="0"/>
-            <w:insideV w:val="single" w:color="000000" w:sz="4" w:space="0"/>
-          </w:tblBorders>
-          <w:tblCellMar>
-            <w:top w:w="0" w:type="dxa"/>
-            <w:left w:w="85" w:type="dxa"/>
-            <w:bottom w:w="0" w:type="dxa"/>
-            <w:right w:w="85" w:type="dxa"/>
-          </w:tblCellMar>
-        </w:tblPrEx>
-        <w:trPr>
-          <w:cantSplit/>
-          <w:jc w:val="center"/>
-        </w:trPr>
-        <w:tc>
-          <w:tcPr>
-            <w:tcW w:w="1516" w:type="dxa"/>
-            <w:vAlign w:val="center"/>
-          </w:tcPr>
-          <w:p>
-            <w:pPr>
-              <w:pStyle w:val="34"/>
-              <w:bidi w:val="0"/>
-            </w:pPr>
-            <w:r>
-              <w:rPr>
-                <w:lang w:val="vi-VN"/>
-              </w:rPr>
-              <w:t>Pre-lab 00</w:t>
-            </w:r>
-          </w:p>
-        </w:tc>
-        <w:tc>
-          <w:tcPr>
-            <w:tcW w:w="2702" w:type="dxa"/>
-            <w:vAlign w:val="center"/>
-          </w:tcPr>
-          <w:p>
-            <w:pPr>
-              <w:pStyle w:val="34"/>
-              <w:bidi w:val="0"/>
-            </w:pPr>
-            <w:r>
-              <w:rPr>
-                <w:lang w:val="vi-VN"/>
-              </w:rPr>
-              <w:t>Chuẩn bị môi trường thực hành</w:t>
-            </w:r>
-          </w:p>
-        </w:tc>
-        <w:tc>
-          <w:tcPr>
-            <w:tcW w:w="4570" w:type="dxa"/>
-            <w:vAlign w:val="center"/>
-          </w:tcPr>
-          <w:p>
-            <w:pPr>
-              <w:pStyle w:val="34"/>
-              <w:bidi w:val="0"/>
-            </w:pPr>
-            <w:r>
-              <w:rPr>
-                <w:lang w:val="vi-VN"/>
-              </w:rPr>
-              <w:t xml:space="preserve">Git, GitHub, VS Code, WSL 2, Docker Desktop hoạt động; </w:t>
-            </w:r>
-            <w:r>
-              <w:t>docker run --rm hello-world</w:t>
-            </w:r>
-            <w:r>
-              <w:rPr>
-                <w:lang w:val="vi-VN"/>
-              </w:rPr>
-              <w:t xml:space="preserve"> thành công</w:t>
-            </w:r>
-          </w:p>
-        </w:tc>
-      </w:tr>
-      <w:tr>
-        <w:tblPrEx>
-          <w:tblBorders>
-            <w:top w:val="single" w:color="000000" w:sz="4" w:space="0"/>
-            <w:left w:val="single" w:color="000000" w:sz="4" w:space="0"/>
-            <w:bottom w:val="single" w:color="000000" w:sz="4" w:space="0"/>
-            <w:right w:val="single" w:color="000000" w:sz="4" w:space="0"/>
-            <w:insideH w:val="single" w:color="000000" w:sz="4" w:space="0"/>
-            <w:insideV w:val="single" w:color="000000" w:sz="4" w:space="0"/>
-          </w:tblBorders>
-          <w:tblCellMar>
-            <w:top w:w="0" w:type="dxa"/>
-            <w:left w:w="85" w:type="dxa"/>
-            <w:bottom w:w="0" w:type="dxa"/>
-            <w:right w:w="85" w:type="dxa"/>
-          </w:tblCellMar>
-        </w:tblPrEx>
-        <w:trPr>
-          <w:cantSplit/>
-          <w:jc w:val="center"/>
-        </w:trPr>
-        <w:tc>
-          <w:tcPr>
-            <w:tcW w:w="1516" w:type="dxa"/>
-            <w:vAlign w:val="center"/>
-          </w:tcPr>
-          <w:p>
-            <w:pPr>
-              <w:pStyle w:val="34"/>
-              <w:bidi w:val="0"/>
-            </w:pPr>
-            <w:r>
-              <w:rPr>
-                <w:lang w:val="vi-VN"/>
-              </w:rPr>
-              <w:t>Hands-on 01</w:t>
-            </w:r>
-          </w:p>
-        </w:tc>
-        <w:tc>
-          <w:tcPr>
-            <w:tcW w:w="2702" w:type="dxa"/>
-            <w:vAlign w:val="center"/>
-          </w:tcPr>
-          <w:p>
-            <w:pPr>
-              <w:pStyle w:val="34"/>
-              <w:bidi w:val="0"/>
-            </w:pPr>
-            <w:r>
-              <w:rPr>
-                <w:lang w:val="vi-VN"/>
-              </w:rPr>
-              <w:t>Khởi tạo dự án PHP với Git/GitHub và Docker</w:t>
-            </w:r>
-          </w:p>
-        </w:tc>
-        <w:tc>
-          <w:tcPr>
-            <w:tcW w:w="4570" w:type="dxa"/>
-            <w:vAlign w:val="center"/>
-          </w:tcPr>
-          <w:p>
-            <w:pPr>
-              <w:pStyle w:val="34"/>
-              <w:bidi w:val="0"/>
-            </w:pPr>
-            <w:r>
-              <w:rPr>
-                <w:lang w:val="vi-VN"/>
-              </w:rPr>
-              <w:t xml:space="preserve">Trang </w:t>
-            </w:r>
-            <w:r>
-              <w:t>index.php</w:t>
-            </w:r>
-            <w:r>
-              <w:rPr>
-                <w:lang w:val="vi-VN"/>
-              </w:rPr>
-              <w:t xml:space="preserve"> chạy trên PHP 8.3 + Apache tại cổng 8080; commit đầu tiên</w:t>
-            </w:r>
-          </w:p>
-        </w:tc>
-      </w:tr>
-      <w:tr>
-        <w:tblPrEx>
-          <w:tblBorders>
-            <w:top w:val="single" w:color="000000" w:sz="4" w:space="0"/>
-            <w:left w:val="single" w:color="000000" w:sz="4" w:space="0"/>
-            <w:bottom w:val="single" w:color="000000" w:sz="4" w:space="0"/>
-            <w:right w:val="single" w:color="000000" w:sz="4" w:space="0"/>
-            <w:insideH w:val="single" w:color="000000" w:sz="4" w:space="0"/>
-            <w:insideV w:val="single" w:color="000000" w:sz="4" w:space="0"/>
-          </w:tblBorders>
-          <w:tblCellMar>
-            <w:top w:w="0" w:type="dxa"/>
-            <w:left w:w="85" w:type="dxa"/>
-            <w:bottom w:w="0" w:type="dxa"/>
-            <w:right w:w="85" w:type="dxa"/>
-          </w:tblCellMar>
-        </w:tblPrEx>
-        <w:trPr>
-          <w:cantSplit/>
-          <w:jc w:val="center"/>
-        </w:trPr>
-        <w:tc>
-          <w:tcPr>
-            <w:tcW w:w="1516" w:type="dxa"/>
-            <w:vAlign w:val="center"/>
-          </w:tcPr>
-          <w:p>
-            <w:pPr>
-              <w:pStyle w:val="34"/>
-              <w:bidi w:val="0"/>
-            </w:pPr>
-            <w:r>
-              <w:rPr>
-                <w:lang w:val="vi-VN"/>
-              </w:rPr>
-              <w:t>Hands-on 02</w:t>
-            </w:r>
-          </w:p>
-        </w:tc>
-        <w:tc>
-          <w:tcPr>
-            <w:tcW w:w="2702" w:type="dxa"/>
-            <w:vAlign w:val="center"/>
-          </w:tcPr>
-          <w:p>
-            <w:pPr>
-              <w:pStyle w:val="34"/>
-              <w:bidi w:val="0"/>
-            </w:pPr>
-            <w:r>
-              <w:rPr>
-                <w:lang w:val="vi-VN"/>
-              </w:rPr>
-              <w:t>Cơ sở dữ liệu MySQL và dữ liệu mẫu</w:t>
-            </w:r>
-          </w:p>
-        </w:tc>
-        <w:tc>
-          <w:tcPr>
-            <w:tcW w:w="4570" w:type="dxa"/>
-            <w:vAlign w:val="center"/>
-          </w:tcPr>
-          <w:p>
-            <w:pPr>
-              <w:pStyle w:val="34"/>
-              <w:bidi w:val="0"/>
-            </w:pPr>
-            <w:r>
-              <w:rPr>
-                <w:lang w:val="vi-VN"/>
-              </w:rPr>
-              <w:t xml:space="preserve">9 bảng, </w:t>
-            </w:r>
-            <w:r>
-              <w:t>schema.sql</w:t>
-            </w:r>
-            <w:r>
-              <w:rPr>
-                <w:lang w:val="vi-VN"/>
-              </w:rPr>
-              <w:t xml:space="preserve">, </w:t>
-            </w:r>
-            <w:r>
-              <w:t>seed.sql</w:t>
-            </w:r>
-            <w:r>
-              <w:rPr>
-                <w:lang w:val="vi-VN"/>
-              </w:rPr>
-              <w:t xml:space="preserve">, named volume </w:t>
-            </w:r>
-            <w:r>
-              <w:t>mysql_data</w:t>
-            </w:r>
-          </w:p>
-        </w:tc>
-      </w:tr>
-      <w:tr>
-        <w:tblPrEx>
-          <w:tblBorders>
-            <w:top w:val="single" w:color="000000" w:sz="4" w:space="0"/>
-            <w:left w:val="single" w:color="000000" w:sz="4" w:space="0"/>
-            <w:bottom w:val="single" w:color="000000" w:sz="4" w:space="0"/>
-            <w:right w:val="single" w:color="000000" w:sz="4" w:space="0"/>
-            <w:insideH w:val="single" w:color="000000" w:sz="4" w:space="0"/>
-            <w:insideV w:val="single" w:color="000000" w:sz="4" w:space="0"/>
-          </w:tblBorders>
-          <w:tblCellMar>
-            <w:top w:w="0" w:type="dxa"/>
-            <w:left w:w="85" w:type="dxa"/>
-            <w:bottom w:w="0" w:type="dxa"/>
-            <w:right w:w="85" w:type="dxa"/>
-          </w:tblCellMar>
-        </w:tblPrEx>
-        <w:trPr>
-          <w:cantSplit/>
-          <w:jc w:val="center"/>
-        </w:trPr>
-        <w:tc>
-          <w:tcPr>
-            <w:tcW w:w="1516" w:type="dxa"/>
-            <w:vAlign w:val="center"/>
-          </w:tcPr>
-          <w:p>
-            <w:pPr>
-              <w:pStyle w:val="34"/>
-              <w:bidi w:val="0"/>
-            </w:pPr>
-            <w:r>
-              <w:rPr>
-                <w:lang w:val="vi-VN"/>
-              </w:rPr>
-              <w:t>Hands-on 03</w:t>
-            </w:r>
-          </w:p>
-        </w:tc>
-        <w:tc>
-          <w:tcPr>
-            <w:tcW w:w="2702" w:type="dxa"/>
-            <w:vAlign w:val="center"/>
-          </w:tcPr>
-          <w:p>
-            <w:pPr>
-              <w:pStyle w:val="34"/>
-              <w:bidi w:val="0"/>
-            </w:pPr>
-            <w:r>
-              <w:rPr>
-                <w:lang w:val="vi-VN"/>
-              </w:rPr>
-              <w:t>Kết nối PHP với MySQL, hiển thị danh mục</w:t>
-            </w:r>
-          </w:p>
-        </w:tc>
-        <w:tc>
-          <w:tcPr>
-            <w:tcW w:w="4570" w:type="dxa"/>
-            <w:vAlign w:val="center"/>
-          </w:tcPr>
-          <w:p>
-            <w:pPr>
-              <w:pStyle w:val="34"/>
-              <w:bidi w:val="0"/>
-            </w:pPr>
-            <w:r>
-              <w:t>database.php</w:t>
-            </w:r>
-            <w:r>
-              <w:rPr>
-                <w:lang w:val="vi-VN"/>
-              </w:rPr>
-              <w:t xml:space="preserve">, bộ layout </w:t>
-            </w:r>
-            <w:r>
-              <w:t>header/navbar/footer</w:t>
-            </w:r>
-            <w:r>
-              <w:rPr>
-                <w:lang w:val="vi-VN"/>
-              </w:rPr>
-              <w:t>, trang danh mục</w:t>
-            </w:r>
-          </w:p>
-        </w:tc>
-      </w:tr>
-      <w:tr>
-        <w:tblPrEx>
-          <w:tblBorders>
-            <w:top w:val="single" w:color="000000" w:sz="4" w:space="0"/>
-            <w:left w:val="single" w:color="000000" w:sz="4" w:space="0"/>
-            <w:bottom w:val="single" w:color="000000" w:sz="4" w:space="0"/>
-            <w:right w:val="single" w:color="000000" w:sz="4" w:space="0"/>
-            <w:insideH w:val="single" w:color="000000" w:sz="4" w:space="0"/>
-            <w:insideV w:val="single" w:color="000000" w:sz="4" w:space="0"/>
-          </w:tblBorders>
-          <w:tblCellMar>
-            <w:top w:w="0" w:type="dxa"/>
-            <w:left w:w="85" w:type="dxa"/>
-            <w:bottom w:w="0" w:type="dxa"/>
-            <w:right w:w="85" w:type="dxa"/>
-          </w:tblCellMar>
-        </w:tblPrEx>
-        <w:trPr>
-          <w:cantSplit/>
-          <w:jc w:val="center"/>
-        </w:trPr>
-        <w:tc>
-          <w:tcPr>
-            <w:tcW w:w="1516" w:type="dxa"/>
-            <w:vAlign w:val="center"/>
-          </w:tcPr>
-          <w:p>
-            <w:pPr>
-              <w:pStyle w:val="34"/>
-              <w:bidi w:val="0"/>
-            </w:pPr>
-            <w:r>
-              <w:rPr>
-                <w:lang w:val="vi-VN"/>
-              </w:rPr>
-              <w:t>Hands-on 04</w:t>
-            </w:r>
-          </w:p>
-        </w:tc>
-        <w:tc>
-          <w:tcPr>
-            <w:tcW w:w="2702" w:type="dxa"/>
-            <w:vAlign w:val="center"/>
-          </w:tcPr>
-          <w:p>
-            <w:pPr>
-              <w:pStyle w:val="34"/>
-              <w:bidi w:val="0"/>
-            </w:pPr>
-            <w:r>
-              <w:rPr>
-                <w:lang w:val="vi-VN"/>
-              </w:rPr>
-              <w:t>CRUD quản lý danh mục</w:t>
-            </w:r>
-          </w:p>
-        </w:tc>
-        <w:tc>
-          <w:tcPr>
-            <w:tcW w:w="4570" w:type="dxa"/>
-            <w:vAlign w:val="center"/>
-          </w:tcPr>
-          <w:p>
-            <w:pPr>
-              <w:pStyle w:val="34"/>
-              <w:bidi w:val="0"/>
-            </w:pPr>
-            <w:r>
-              <w:rPr>
-                <w:lang w:val="vi-VN"/>
-              </w:rPr>
-              <w:t>Thêm, sửa, xóa bằng prepared statement và biểu mẫu POST</w:t>
-            </w:r>
-          </w:p>
-        </w:tc>
-      </w:tr>
-      <w:tr>
-        <w:tblPrEx>
-          <w:tblBorders>
-            <w:top w:val="single" w:color="000000" w:sz="4" w:space="0"/>
-            <w:left w:val="single" w:color="000000" w:sz="4" w:space="0"/>
-            <w:bottom w:val="single" w:color="000000" w:sz="4" w:space="0"/>
-            <w:right w:val="single" w:color="000000" w:sz="4" w:space="0"/>
-            <w:insideH w:val="single" w:color="000000" w:sz="4" w:space="0"/>
-            <w:insideV w:val="single" w:color="000000" w:sz="4" w:space="0"/>
-          </w:tblBorders>
-          <w:tblCellMar>
-            <w:top w:w="0" w:type="dxa"/>
-            <w:left w:w="85" w:type="dxa"/>
-            <w:bottom w:w="0" w:type="dxa"/>
-            <w:right w:w="85" w:type="dxa"/>
-          </w:tblCellMar>
-        </w:tblPrEx>
-        <w:trPr>
-          <w:cantSplit/>
-          <w:jc w:val="center"/>
-        </w:trPr>
-        <w:tc>
-          <w:tcPr>
-            <w:tcW w:w="1516" w:type="dxa"/>
-            <w:vAlign w:val="center"/>
-          </w:tcPr>
-          <w:p>
-            <w:pPr>
-              <w:pStyle w:val="34"/>
-              <w:bidi w:val="0"/>
-            </w:pPr>
-            <w:r>
-              <w:rPr>
-                <w:lang w:val="vi-VN"/>
-              </w:rPr>
-              <w:t>Hands-on 05</w:t>
-            </w:r>
-          </w:p>
-        </w:tc>
-        <w:tc>
-          <w:tcPr>
-            <w:tcW w:w="2702" w:type="dxa"/>
-            <w:vAlign w:val="center"/>
-          </w:tcPr>
-          <w:p>
-            <w:pPr>
-              <w:pStyle w:val="34"/>
-              <w:bidi w:val="0"/>
-            </w:pPr>
-            <w:r>
-              <w:rPr>
-                <w:lang w:val="vi-VN"/>
-              </w:rPr>
-              <w:t>Quản lý sản phẩm và dữ liệu quan hệ</w:t>
-            </w:r>
-          </w:p>
-        </w:tc>
-        <w:tc>
-          <w:tcPr>
-            <w:tcW w:w="4570" w:type="dxa"/>
-            <w:vAlign w:val="center"/>
-          </w:tcPr>
-          <w:p>
-            <w:pPr>
-              <w:pStyle w:val="34"/>
-              <w:bidi w:val="0"/>
-            </w:pPr>
-            <w:r>
-              <w:rPr>
-                <w:lang w:val="vi-VN"/>
-              </w:rPr>
-              <w:t xml:space="preserve">Chuẩn hóa </w:t>
-            </w:r>
-            <w:r>
-              <w:t>NOT NULL</w:t>
-            </w:r>
-            <w:r>
-              <w:rPr>
-                <w:lang w:val="vi-VN"/>
-              </w:rPr>
-              <w:t xml:space="preserve"> cho khóa ngoại, CRUD sản phẩm, hiển thị ảnh chính</w:t>
-            </w:r>
-          </w:p>
-        </w:tc>
-      </w:tr>
-      <w:tr>
-        <w:tblPrEx>
-          <w:tblBorders>
-            <w:top w:val="single" w:color="000000" w:sz="4" w:space="0"/>
-            <w:left w:val="single" w:color="000000" w:sz="4" w:space="0"/>
-            <w:bottom w:val="single" w:color="000000" w:sz="4" w:space="0"/>
-            <w:right w:val="single" w:color="000000" w:sz="4" w:space="0"/>
-            <w:insideH w:val="single" w:color="000000" w:sz="4" w:space="0"/>
-            <w:insideV w:val="single" w:color="000000" w:sz="4" w:space="0"/>
-          </w:tblBorders>
-          <w:tblCellMar>
-            <w:top w:w="0" w:type="dxa"/>
-            <w:left w:w="85" w:type="dxa"/>
-            <w:bottom w:w="0" w:type="dxa"/>
-            <w:right w:w="85" w:type="dxa"/>
-          </w:tblCellMar>
-        </w:tblPrEx>
-        <w:trPr>
-          <w:cantSplit/>
-          <w:jc w:val="center"/>
-        </w:trPr>
-        <w:tc>
-          <w:tcPr>
-            <w:tcW w:w="1516" w:type="dxa"/>
-            <w:vAlign w:val="center"/>
-          </w:tcPr>
-          <w:p>
-            <w:pPr>
-              <w:pStyle w:val="34"/>
-              <w:bidi w:val="0"/>
-            </w:pPr>
-            <w:r>
-              <w:rPr>
-                <w:lang w:val="vi-VN"/>
-              </w:rPr>
-              <w:t>Hands-on 06</w:t>
-            </w:r>
-          </w:p>
-        </w:tc>
-        <w:tc>
-          <w:tcPr>
-            <w:tcW w:w="2702" w:type="dxa"/>
-            <w:vAlign w:val="center"/>
-          </w:tcPr>
-          <w:p>
-            <w:pPr>
-              <w:pStyle w:val="34"/>
-              <w:bidi w:val="0"/>
-            </w:pPr>
-            <w:r>
-              <w:rPr>
-                <w:lang w:val="vi-VN"/>
-              </w:rPr>
-              <w:t>Tải lên hình ảnh sản phẩm</w:t>
-            </w:r>
-          </w:p>
-        </w:tc>
-        <w:tc>
-          <w:tcPr>
-            <w:tcW w:w="4570" w:type="dxa"/>
-            <w:vAlign w:val="center"/>
-          </w:tcPr>
-          <w:p>
-            <w:pPr>
-              <w:pStyle w:val="34"/>
-              <w:bidi w:val="0"/>
-            </w:pPr>
-            <w:r>
-              <w:rPr>
-                <w:lang w:val="vi-VN"/>
-              </w:rPr>
-              <w:t>Kiểm tra tệp, đặt tên ngẫu nhiên, transaction, 1 – 4 ảnh</w:t>
-            </w:r>
-          </w:p>
-        </w:tc>
-      </w:tr>
-      <w:tr>
-        <w:tblPrEx>
-          <w:tblBorders>
-            <w:top w:val="single" w:color="000000" w:sz="4" w:space="0"/>
-            <w:left w:val="single" w:color="000000" w:sz="4" w:space="0"/>
-            <w:bottom w:val="single" w:color="000000" w:sz="4" w:space="0"/>
-            <w:right w:val="single" w:color="000000" w:sz="4" w:space="0"/>
-            <w:insideH w:val="single" w:color="000000" w:sz="4" w:space="0"/>
-            <w:insideV w:val="single" w:color="000000" w:sz="4" w:space="0"/>
-          </w:tblBorders>
-          <w:tblCellMar>
-            <w:top w:w="0" w:type="dxa"/>
-            <w:left w:w="85" w:type="dxa"/>
-            <w:bottom w:w="0" w:type="dxa"/>
-            <w:right w:w="85" w:type="dxa"/>
-          </w:tblCellMar>
-        </w:tblPrEx>
-        <w:trPr>
-          <w:cantSplit/>
-          <w:jc w:val="center"/>
-        </w:trPr>
-        <w:tc>
-          <w:tcPr>
-            <w:tcW w:w="1516" w:type="dxa"/>
-            <w:vAlign w:val="center"/>
-          </w:tcPr>
-          <w:p>
-            <w:pPr>
-              <w:pStyle w:val="34"/>
-              <w:bidi w:val="0"/>
-            </w:pPr>
-            <w:r>
-              <w:rPr>
-                <w:lang w:val="vi-VN"/>
-              </w:rPr>
-              <w:t>Hands-on 07</w:t>
-            </w:r>
-          </w:p>
-        </w:tc>
-        <w:tc>
-          <w:tcPr>
-            <w:tcW w:w="2702" w:type="dxa"/>
-            <w:vAlign w:val="center"/>
-          </w:tcPr>
-          <w:p>
-            <w:pPr>
-              <w:pStyle w:val="34"/>
-              <w:bidi w:val="0"/>
-            </w:pPr>
-            <w:r>
-              <w:rPr>
-                <w:lang w:val="vi-VN"/>
-              </w:rPr>
-              <w:t>Quản lý hình ảnh khi cập nhật</w:t>
-            </w:r>
-          </w:p>
-        </w:tc>
-        <w:tc>
-          <w:tcPr>
-            <w:tcW w:w="4570" w:type="dxa"/>
-            <w:vAlign w:val="center"/>
-          </w:tcPr>
-          <w:p>
-            <w:pPr>
-              <w:pStyle w:val="34"/>
-              <w:bidi w:val="0"/>
-            </w:pPr>
-            <w:r>
-              <w:rPr>
-                <w:lang w:val="vi-VN"/>
-              </w:rPr>
-              <w:t xml:space="preserve">Đặt ảnh chính, thêm ảnh, xóa ảnh, chuẩn hóa </w:t>
-            </w:r>
-            <w:r>
-              <w:t>SortOrder</w:t>
-            </w:r>
-          </w:p>
-        </w:tc>
-      </w:tr>
-      <w:tr>
-        <w:tblPrEx>
-          <w:tblBorders>
-            <w:top w:val="single" w:color="000000" w:sz="4" w:space="0"/>
-            <w:left w:val="single" w:color="000000" w:sz="4" w:space="0"/>
-            <w:bottom w:val="single" w:color="000000" w:sz="4" w:space="0"/>
-            <w:right w:val="single" w:color="000000" w:sz="4" w:space="0"/>
-            <w:insideH w:val="single" w:color="000000" w:sz="4" w:space="0"/>
-            <w:insideV w:val="single" w:color="000000" w:sz="4" w:space="0"/>
-          </w:tblBorders>
-          <w:tblCellMar>
-            <w:top w:w="0" w:type="dxa"/>
-            <w:left w:w="85" w:type="dxa"/>
-            <w:bottom w:w="0" w:type="dxa"/>
-            <w:right w:w="85" w:type="dxa"/>
-          </w:tblCellMar>
-        </w:tblPrEx>
-        <w:trPr>
-          <w:cantSplit/>
-          <w:jc w:val="center"/>
-        </w:trPr>
-        <w:tc>
-          <w:tcPr>
-            <w:tcW w:w="1516" w:type="dxa"/>
-            <w:vAlign w:val="center"/>
-          </w:tcPr>
-          <w:p>
-            <w:pPr>
-              <w:pStyle w:val="34"/>
-              <w:bidi w:val="0"/>
-            </w:pPr>
-            <w:r>
-              <w:rPr>
-                <w:lang w:val="vi-VN"/>
-              </w:rPr>
-              <w:t>Hands-on 08</w:t>
-            </w:r>
-          </w:p>
-        </w:tc>
-        <w:tc>
-          <w:tcPr>
-            <w:tcW w:w="2702" w:type="dxa"/>
-            <w:vAlign w:val="center"/>
-          </w:tcPr>
-          <w:p>
-            <w:pPr>
-              <w:pStyle w:val="34"/>
-              <w:bidi w:val="0"/>
-            </w:pPr>
-            <w:r>
-              <w:rPr>
-                <w:lang w:val="vi-VN"/>
-              </w:rPr>
-              <w:t>Tổ chức khu vực Admin và Frontend</w:t>
-            </w:r>
-          </w:p>
-        </w:tc>
-        <w:tc>
-          <w:tcPr>
-            <w:tcW w:w="4570" w:type="dxa"/>
-            <w:vAlign w:val="center"/>
-          </w:tcPr>
-          <w:p>
-            <w:pPr>
-              <w:pStyle w:val="34"/>
-              <w:bidi w:val="0"/>
-            </w:pPr>
-            <w:r>
-              <w:rPr>
-                <w:lang w:val="vi-VN"/>
-              </w:rPr>
-              <w:t xml:space="preserve">Thư mục </w:t>
-            </w:r>
-            <w:r>
-              <w:t>public/admin</w:t>
-            </w:r>
-            <w:r>
-              <w:rPr>
-                <w:lang w:val="vi-VN"/>
-              </w:rPr>
-              <w:t xml:space="preserve">, </w:t>
-            </w:r>
-            <w:r>
-              <w:t>includes/admin</w:t>
-            </w:r>
-            <w:r>
-              <w:rPr>
-                <w:lang w:val="vi-VN"/>
-              </w:rPr>
-              <w:t xml:space="preserve">, </w:t>
-            </w:r>
-            <w:r>
-              <w:t>includes/frontend</w:t>
-            </w:r>
-          </w:p>
-        </w:tc>
-      </w:tr>
-      <w:tr>
-        <w:tblPrEx>
-          <w:tblBorders>
-            <w:top w:val="single" w:color="000000" w:sz="4" w:space="0"/>
-            <w:left w:val="single" w:color="000000" w:sz="4" w:space="0"/>
-            <w:bottom w:val="single" w:color="000000" w:sz="4" w:space="0"/>
-            <w:right w:val="single" w:color="000000" w:sz="4" w:space="0"/>
-            <w:insideH w:val="single" w:color="000000" w:sz="4" w:space="0"/>
-            <w:insideV w:val="single" w:color="000000" w:sz="4" w:space="0"/>
-          </w:tblBorders>
-          <w:tblCellMar>
-            <w:top w:w="0" w:type="dxa"/>
-            <w:left w:w="85" w:type="dxa"/>
-            <w:bottom w:w="0" w:type="dxa"/>
-            <w:right w:w="85" w:type="dxa"/>
-          </w:tblCellMar>
-        </w:tblPrEx>
-        <w:trPr>
-          <w:cantSplit/>
-          <w:jc w:val="center"/>
-        </w:trPr>
-        <w:tc>
-          <w:tcPr>
-            <w:tcW w:w="1516" w:type="dxa"/>
-            <w:vAlign w:val="center"/>
-          </w:tcPr>
-          <w:p>
-            <w:pPr>
-              <w:pStyle w:val="34"/>
-              <w:bidi w:val="0"/>
-            </w:pPr>
-            <w:r>
-              <w:rPr>
-                <w:lang w:val="vi-VN"/>
-              </w:rPr>
-              <w:t>Hands-on 09</w:t>
-            </w:r>
-          </w:p>
-        </w:tc>
-        <w:tc>
-          <w:tcPr>
-            <w:tcW w:w="2702" w:type="dxa"/>
-            <w:vAlign w:val="center"/>
-          </w:tcPr>
-          <w:p>
-            <w:pPr>
-              <w:pStyle w:val="34"/>
-              <w:bidi w:val="0"/>
-            </w:pPr>
-            <w:r>
-              <w:rPr>
-                <w:lang w:val="vi-VN"/>
-              </w:rPr>
-              <w:t>Danh sách và chi tiết sản phẩm cho người dùng</w:t>
-            </w:r>
-          </w:p>
-        </w:tc>
-        <w:tc>
-          <w:tcPr>
-            <w:tcW w:w="4570" w:type="dxa"/>
-            <w:vAlign w:val="center"/>
-          </w:tcPr>
-          <w:p>
-            <w:pPr>
-              <w:pStyle w:val="34"/>
-              <w:bidi w:val="0"/>
-            </w:pPr>
-            <w:r>
-              <w:rPr>
-                <w:lang w:val="vi-VN"/>
-              </w:rPr>
-              <w:t xml:space="preserve">Trang </w:t>
-            </w:r>
-            <w:r>
-              <w:t>products.php</w:t>
-            </w:r>
-            <w:r>
-              <w:rPr>
-                <w:lang w:val="vi-VN"/>
-              </w:rPr>
-              <w:t xml:space="preserve">, </w:t>
-            </w:r>
-            <w:r>
-              <w:t>product-detail.php?id=...</w:t>
-            </w:r>
-            <w:r>
-              <w:rPr>
-                <w:lang w:val="vi-VN"/>
-              </w:rPr>
-              <w:t xml:space="preserve"> dùng Bootstrap Card</w:t>
-            </w:r>
-          </w:p>
-        </w:tc>
-      </w:tr>
-      <w:tr>
-        <w:tblPrEx>
-          <w:tblBorders>
-            <w:top w:val="single" w:color="000000" w:sz="4" w:space="0"/>
-            <w:left w:val="single" w:color="000000" w:sz="4" w:space="0"/>
-            <w:bottom w:val="single" w:color="000000" w:sz="4" w:space="0"/>
-            <w:right w:val="single" w:color="000000" w:sz="4" w:space="0"/>
-            <w:insideH w:val="single" w:color="000000" w:sz="4" w:space="0"/>
-            <w:insideV w:val="single" w:color="000000" w:sz="4" w:space="0"/>
-          </w:tblBorders>
-          <w:tblCellMar>
-            <w:top w:w="0" w:type="dxa"/>
-            <w:left w:w="85" w:type="dxa"/>
-            <w:bottom w:w="0" w:type="dxa"/>
-            <w:right w:w="85" w:type="dxa"/>
-          </w:tblCellMar>
-        </w:tblPrEx>
-        <w:trPr>
-          <w:cantSplit/>
-          <w:jc w:val="center"/>
-        </w:trPr>
-        <w:tc>
-          <w:tcPr>
-            <w:tcW w:w="1516" w:type="dxa"/>
-            <w:vAlign w:val="center"/>
-          </w:tcPr>
-          <w:p>
-            <w:pPr>
-              <w:pStyle w:val="34"/>
-              <w:bidi w:val="0"/>
-            </w:pPr>
-            <w:r>
-              <w:rPr>
-                <w:lang w:val="vi-VN"/>
-              </w:rPr>
-              <w:t>Hands-on 10</w:t>
-            </w:r>
-          </w:p>
-        </w:tc>
-        <w:tc>
-          <w:tcPr>
-            <w:tcW w:w="2702" w:type="dxa"/>
-            <w:vAlign w:val="center"/>
-          </w:tcPr>
-          <w:p>
-            <w:pPr>
-              <w:pStyle w:val="34"/>
-              <w:bidi w:val="0"/>
-            </w:pPr>
-            <w:r>
-              <w:rPr>
-                <w:lang w:val="vi-VN"/>
-              </w:rPr>
-              <w:t>Tìm kiếm, lọc và phân trang</w:t>
-            </w:r>
-          </w:p>
-        </w:tc>
-        <w:tc>
-          <w:tcPr>
-            <w:tcW w:w="4570" w:type="dxa"/>
-            <w:vAlign w:val="center"/>
-          </w:tcPr>
-          <w:p>
-            <w:pPr>
-              <w:pStyle w:val="34"/>
-              <w:bidi w:val="0"/>
-            </w:pPr>
-            <w:r>
-              <w:rPr>
-                <w:lang w:val="vi-VN"/>
-              </w:rPr>
-              <w:t xml:space="preserve">Tham số GET, </w:t>
-            </w:r>
-            <w:r>
-              <w:t>COUNT(*)</w:t>
-            </w:r>
-            <w:r>
-              <w:rPr>
-                <w:lang w:val="vi-VN"/>
-              </w:rPr>
-              <w:t xml:space="preserve">, </w:t>
-            </w:r>
-            <w:r>
-              <w:t>LIMIT</w:t>
-            </w:r>
-            <w:r>
-              <w:rPr>
-                <w:lang w:val="vi-VN"/>
-              </w:rPr>
-              <w:t>/</w:t>
-            </w:r>
-            <w:r>
-              <w:t>OFFSET</w:t>
-            </w:r>
-            <w:r>
-              <w:rPr>
-                <w:lang w:val="vi-VN"/>
-              </w:rPr>
-              <w:t>, 6 sản phẩm mỗi trang</w:t>
-            </w:r>
-          </w:p>
-        </w:tc>
-      </w:tr>
-      <w:tr>
-        <w:tblPrEx>
-          <w:tblBorders>
-            <w:top w:val="single" w:color="000000" w:sz="4" w:space="0"/>
-            <w:left w:val="single" w:color="000000" w:sz="4" w:space="0"/>
-            <w:bottom w:val="single" w:color="000000" w:sz="4" w:space="0"/>
-            <w:right w:val="single" w:color="000000" w:sz="4" w:space="0"/>
-            <w:insideH w:val="single" w:color="000000" w:sz="4" w:space="0"/>
-            <w:insideV w:val="single" w:color="000000" w:sz="4" w:space="0"/>
-          </w:tblBorders>
-          <w:tblCellMar>
-            <w:top w:w="0" w:type="dxa"/>
-            <w:left w:w="85" w:type="dxa"/>
-            <w:bottom w:w="0" w:type="dxa"/>
-            <w:right w:w="85" w:type="dxa"/>
-          </w:tblCellMar>
-        </w:tblPrEx>
-        <w:trPr>
-          <w:cantSplit/>
-          <w:jc w:val="center"/>
-        </w:trPr>
-        <w:tc>
-          <w:tcPr>
-            <w:tcW w:w="1516" w:type="dxa"/>
-            <w:vAlign w:val="center"/>
-          </w:tcPr>
-          <w:p>
-            <w:pPr>
-              <w:pStyle w:val="34"/>
-              <w:bidi w:val="0"/>
-            </w:pPr>
-            <w:r>
-              <w:rPr>
-                <w:lang w:val="vi-VN"/>
-              </w:rPr>
-              <w:t>Hands-on 11</w:t>
-            </w:r>
-          </w:p>
-        </w:tc>
-        <w:tc>
-          <w:tcPr>
-            <w:tcW w:w="2702" w:type="dxa"/>
-            <w:vAlign w:val="center"/>
-          </w:tcPr>
-          <w:p>
-            <w:pPr>
-              <w:pStyle w:val="34"/>
-              <w:bidi w:val="0"/>
-            </w:pPr>
-            <w:r>
-              <w:rPr>
-                <w:lang w:val="vi-VN"/>
-              </w:rPr>
-              <w:t>Giỏ hàng bằng PHP Session</w:t>
-            </w:r>
-          </w:p>
-        </w:tc>
-        <w:tc>
-          <w:tcPr>
-            <w:tcW w:w="4570" w:type="dxa"/>
-            <w:vAlign w:val="center"/>
-          </w:tcPr>
-          <w:p>
-            <w:pPr>
-              <w:pStyle w:val="34"/>
-              <w:bidi w:val="0"/>
-            </w:pPr>
-            <w:r>
-              <w:rPr>
-                <w:lang w:val="vi-VN"/>
-              </w:rPr>
-              <w:t xml:space="preserve">Cấu trúc </w:t>
-            </w:r>
-            <w:r>
-              <w:t>ProductID =&gt; Quantity</w:t>
-            </w:r>
-            <w:r>
-              <w:rPr>
-                <w:lang w:val="vi-VN"/>
-              </w:rPr>
-              <w:t xml:space="preserve">, trang </w:t>
-            </w:r>
-            <w:r>
-              <w:t>cart.php</w:t>
-            </w:r>
-            <w:r>
-              <w:rPr>
-                <w:lang w:val="vi-VN"/>
-              </w:rPr>
-              <w:t>, số lượng trên Navbar</w:t>
-            </w:r>
-          </w:p>
-        </w:tc>
-      </w:tr>
-      <w:tr>
-        <w:tblPrEx>
-          <w:tblBorders>
-            <w:top w:val="single" w:color="000000" w:sz="4" w:space="0"/>
-            <w:left w:val="single" w:color="000000" w:sz="4" w:space="0"/>
-            <w:bottom w:val="single" w:color="000000" w:sz="4" w:space="0"/>
-            <w:right w:val="single" w:color="000000" w:sz="4" w:space="0"/>
-            <w:insideH w:val="single" w:color="000000" w:sz="4" w:space="0"/>
-            <w:insideV w:val="single" w:color="000000" w:sz="4" w:space="0"/>
-          </w:tblBorders>
-          <w:tblCellMar>
-            <w:top w:w="0" w:type="dxa"/>
-            <w:left w:w="85" w:type="dxa"/>
-            <w:bottom w:w="0" w:type="dxa"/>
-            <w:right w:w="85" w:type="dxa"/>
-          </w:tblCellMar>
-        </w:tblPrEx>
-        <w:trPr>
-          <w:cantSplit/>
-          <w:jc w:val="center"/>
-        </w:trPr>
-        <w:tc>
-          <w:tcPr>
-            <w:tcW w:w="1516" w:type="dxa"/>
-            <w:vAlign w:val="center"/>
-          </w:tcPr>
-          <w:p>
-            <w:pPr>
-              <w:pStyle w:val="34"/>
-              <w:bidi w:val="0"/>
-            </w:pPr>
-            <w:r>
-              <w:rPr>
-                <w:lang w:val="vi-VN"/>
-              </w:rPr>
-              <w:t>Hands-on 12</w:t>
-            </w:r>
-          </w:p>
-        </w:tc>
-        <w:tc>
-          <w:tcPr>
-            <w:tcW w:w="2702" w:type="dxa"/>
-            <w:vAlign w:val="center"/>
-          </w:tcPr>
-          <w:p>
-            <w:pPr>
-              <w:pStyle w:val="34"/>
-              <w:bidi w:val="0"/>
-            </w:pPr>
-            <w:r>
-              <w:rPr>
-                <w:lang w:val="vi-VN"/>
-              </w:rPr>
-              <w:t>Đặt hàng và lưu đơn vào MySQL</w:t>
-            </w:r>
-          </w:p>
-        </w:tc>
-        <w:tc>
-          <w:tcPr>
-            <w:tcW w:w="4570" w:type="dxa"/>
-            <w:vAlign w:val="center"/>
-          </w:tcPr>
-          <w:p>
-            <w:pPr>
-              <w:pStyle w:val="34"/>
-              <w:bidi w:val="0"/>
-            </w:pPr>
-            <w:r>
-              <w:rPr>
-                <w:lang w:val="vi-VN"/>
-              </w:rPr>
-              <w:t xml:space="preserve">Checkout, transaction, </w:t>
-            </w:r>
-            <w:r>
-              <w:t>FOR UPDATE</w:t>
-            </w:r>
-            <w:r>
-              <w:rPr>
-                <w:lang w:val="vi-VN"/>
-              </w:rPr>
-              <w:t xml:space="preserve">, </w:t>
-            </w:r>
-            <w:r>
-              <w:t>TotalAmount</w:t>
-            </w:r>
-            <w:r>
-              <w:rPr>
-                <w:lang w:val="vi-VN"/>
-              </w:rPr>
-              <w:t xml:space="preserve">, </w:t>
-            </w:r>
-            <w:r>
-              <w:t>Status</w:t>
-            </w:r>
-          </w:p>
-        </w:tc>
-      </w:tr>
-      <w:tr>
-        <w:tblPrEx>
-          <w:tblBorders>
-            <w:top w:val="single" w:color="000000" w:sz="4" w:space="0"/>
-            <w:left w:val="single" w:color="000000" w:sz="4" w:space="0"/>
-            <w:bottom w:val="single" w:color="000000" w:sz="4" w:space="0"/>
-            <w:right w:val="single" w:color="000000" w:sz="4" w:space="0"/>
-            <w:insideH w:val="single" w:color="000000" w:sz="4" w:space="0"/>
-            <w:insideV w:val="single" w:color="000000" w:sz="4" w:space="0"/>
-          </w:tblBorders>
-          <w:tblCellMar>
-            <w:top w:w="0" w:type="dxa"/>
-            <w:left w:w="85" w:type="dxa"/>
-            <w:bottom w:w="0" w:type="dxa"/>
-            <w:right w:w="85" w:type="dxa"/>
-          </w:tblCellMar>
-        </w:tblPrEx>
-        <w:trPr>
-          <w:cantSplit/>
-          <w:jc w:val="center"/>
-        </w:trPr>
-        <w:tc>
-          <w:tcPr>
-            <w:tcW w:w="1516" w:type="dxa"/>
-            <w:vAlign w:val="center"/>
-          </w:tcPr>
-          <w:p>
-            <w:pPr>
-              <w:pStyle w:val="34"/>
-              <w:bidi w:val="0"/>
-            </w:pPr>
-            <w:r>
-              <w:rPr>
-                <w:lang w:val="vi-VN"/>
-              </w:rPr>
-              <w:t>Hands-on 13</w:t>
-            </w:r>
-          </w:p>
-        </w:tc>
-        <w:tc>
-          <w:tcPr>
-            <w:tcW w:w="2702" w:type="dxa"/>
-            <w:vAlign w:val="center"/>
-          </w:tcPr>
-          <w:p>
-            <w:pPr>
-              <w:pStyle w:val="34"/>
-              <w:bidi w:val="0"/>
-            </w:pPr>
-            <w:r>
-              <w:rPr>
-                <w:lang w:val="vi-VN"/>
-              </w:rPr>
-              <w:t>Quản lý đơn hàng trong Admin</w:t>
-            </w:r>
-          </w:p>
-        </w:tc>
-        <w:tc>
-          <w:tcPr>
-            <w:tcW w:w="4570" w:type="dxa"/>
-            <w:vAlign w:val="center"/>
-          </w:tcPr>
-          <w:p>
-            <w:pPr>
-              <w:pStyle w:val="34"/>
-              <w:bidi w:val="0"/>
-            </w:pPr>
-            <w:r>
-              <w:rPr>
-                <w:lang w:val="vi-VN"/>
-              </w:rPr>
-              <w:t>Vòng đời 5 trạng thái, hủy đơn và hoàn tồn kho</w:t>
-            </w:r>
-          </w:p>
-        </w:tc>
-      </w:tr>
-      <w:tr>
-        <w:tblPrEx>
-          <w:tblBorders>
-            <w:top w:val="single" w:color="000000" w:sz="4" w:space="0"/>
-            <w:left w:val="single" w:color="000000" w:sz="4" w:space="0"/>
-            <w:bottom w:val="single" w:color="000000" w:sz="4" w:space="0"/>
-            <w:right w:val="single" w:color="000000" w:sz="4" w:space="0"/>
-            <w:insideH w:val="single" w:color="000000" w:sz="4" w:space="0"/>
-            <w:insideV w:val="single" w:color="000000" w:sz="4" w:space="0"/>
-          </w:tblBorders>
-          <w:tblCellMar>
-            <w:top w:w="0" w:type="dxa"/>
-            <w:left w:w="85" w:type="dxa"/>
-            <w:bottom w:w="0" w:type="dxa"/>
-            <w:right w:w="85" w:type="dxa"/>
-          </w:tblCellMar>
-        </w:tblPrEx>
-        <w:trPr>
-          <w:cantSplit/>
-          <w:jc w:val="center"/>
-        </w:trPr>
-        <w:tc>
-          <w:tcPr>
-            <w:tcW w:w="1516" w:type="dxa"/>
-            <w:vAlign w:val="center"/>
-          </w:tcPr>
-          <w:p>
-            <w:pPr>
-              <w:pStyle w:val="34"/>
-              <w:bidi w:val="0"/>
-            </w:pPr>
-            <w:r>
-              <w:rPr>
-                <w:lang w:val="vi-VN"/>
-              </w:rPr>
-              <w:t>Hands-on 14</w:t>
-            </w:r>
-          </w:p>
-        </w:tc>
-        <w:tc>
-          <w:tcPr>
-            <w:tcW w:w="2702" w:type="dxa"/>
-            <w:vAlign w:val="center"/>
-          </w:tcPr>
-          <w:p>
-            <w:pPr>
-              <w:pStyle w:val="34"/>
-              <w:bidi w:val="0"/>
-            </w:pPr>
-            <w:r>
-              <w:rPr>
-                <w:lang w:val="vi-VN"/>
-              </w:rPr>
-              <w:t>Đăng ký, đăng nhập, tài khoản khách hàng</w:t>
-            </w:r>
-          </w:p>
-        </w:tc>
-        <w:tc>
-          <w:tcPr>
-            <w:tcW w:w="4570" w:type="dxa"/>
-            <w:vAlign w:val="center"/>
-          </w:tcPr>
-          <w:p>
-            <w:pPr>
-              <w:pStyle w:val="34"/>
-              <w:bidi w:val="0"/>
-            </w:pPr>
-            <w:r>
-              <w:t>password_hash()</w:t>
-            </w:r>
-            <w:r>
-              <w:rPr>
-                <w:lang w:val="vi-VN"/>
-              </w:rPr>
-              <w:t xml:space="preserve">, </w:t>
-            </w:r>
-            <w:r>
-              <w:t>password_verify()</w:t>
-            </w:r>
-            <w:r>
-              <w:rPr>
-                <w:lang w:val="vi-VN"/>
-              </w:rPr>
-              <w:t>, Session, Checkout cho khách đăng nhập</w:t>
-            </w:r>
-          </w:p>
-        </w:tc>
-      </w:tr>
-      <w:tr>
-        <w:tblPrEx>
-          <w:tblBorders>
-            <w:top w:val="single" w:color="000000" w:sz="4" w:space="0"/>
-            <w:left w:val="single" w:color="000000" w:sz="4" w:space="0"/>
-            <w:bottom w:val="single" w:color="000000" w:sz="4" w:space="0"/>
-            <w:right w:val="single" w:color="000000" w:sz="4" w:space="0"/>
-            <w:insideH w:val="single" w:color="000000" w:sz="4" w:space="0"/>
-            <w:insideV w:val="single" w:color="000000" w:sz="4" w:space="0"/>
-          </w:tblBorders>
-          <w:tblCellMar>
-            <w:top w:w="0" w:type="dxa"/>
-            <w:left w:w="85" w:type="dxa"/>
-            <w:bottom w:w="0" w:type="dxa"/>
-            <w:right w:w="85" w:type="dxa"/>
-          </w:tblCellMar>
-        </w:tblPrEx>
-        <w:trPr>
-          <w:cantSplit/>
-          <w:jc w:val="center"/>
-        </w:trPr>
-        <w:tc>
-          <w:tcPr>
-            <w:tcW w:w="1516" w:type="dxa"/>
-            <w:vAlign w:val="center"/>
-          </w:tcPr>
-          <w:p>
-            <w:pPr>
-              <w:pStyle w:val="34"/>
-              <w:bidi w:val="0"/>
-            </w:pPr>
-            <w:r>
-              <w:rPr>
-                <w:lang w:val="vi-VN"/>
-              </w:rPr>
-              <w:t>Hands-on 15</w:t>
-            </w:r>
-          </w:p>
-        </w:tc>
-        <w:tc>
-          <w:tcPr>
-            <w:tcW w:w="2702" w:type="dxa"/>
-            <w:vAlign w:val="center"/>
-          </w:tcPr>
-          <w:p>
-            <w:pPr>
-              <w:pStyle w:val="34"/>
-              <w:bidi w:val="0"/>
-            </w:pPr>
-            <w:r>
-              <w:rPr>
-                <w:lang w:val="vi-VN"/>
-              </w:rPr>
-              <w:t>REST API và Fetch API</w:t>
-            </w:r>
-          </w:p>
-        </w:tc>
-        <w:tc>
-          <w:tcPr>
-            <w:tcW w:w="4570" w:type="dxa"/>
-            <w:vAlign w:val="center"/>
-          </w:tcPr>
-          <w:p>
-            <w:pPr>
-              <w:pStyle w:val="34"/>
-              <w:bidi w:val="0"/>
-            </w:pPr>
-            <w:r>
-              <w:t>/api/categories.php</w:t>
-            </w:r>
-            <w:r>
-              <w:rPr>
-                <w:lang w:val="vi-VN"/>
-              </w:rPr>
-              <w:t xml:space="preserve">, </w:t>
-            </w:r>
-            <w:r>
-              <w:t>/api/products.php</w:t>
-            </w:r>
-            <w:r>
-              <w:rPr>
-                <w:lang w:val="vi-VN"/>
-              </w:rPr>
-              <w:t xml:space="preserve">, trang </w:t>
-            </w:r>
-            <w:r>
-              <w:t>products-api.php</w:t>
-            </w:r>
-          </w:p>
-        </w:tc>
-      </w:tr>
-    </w:tbl>
+      <w:bookmarkStart w:id="15" w:name="_Toc7140"/>
+      <w:r>
+        <w:rPr>
+          <w:lang w:val="vi-VN"/>
+        </w:rPr>
+        <w:t>. Sơ đồ tổng quan kiến trúc hệ thống</w:t>
+      </w:r>
+      <w:bookmarkEnd w:id="15"/>
+    </w:p>
     <w:p>
       <w:pPr>
         <w:spacing w:before="0" w:after="0" w:line="160" w:lineRule="exact"/>
@@ -13535,38 +11955,38 @@
         </w:numPr>
         <w:jc w:val="center"/>
       </w:pPr>
-      <w:bookmarkStart w:id="18" w:name="_Toc8376"/>
+      <w:bookmarkStart w:id="16" w:name="_Toc8376"/>
       <w:r>
         <w:t>CƠ SỞ LÝ THUYẾT</w:t>
       </w:r>
-      <w:bookmarkEnd w:id="18"/>
+      <w:bookmarkEnd w:id="16"/>
     </w:p>
     <w:p>
       <w:pPr>
         <w:pStyle w:val="3"/>
       </w:pPr>
-      <w:bookmarkStart w:id="19" w:name="_Toc7373"/>
+      <w:bookmarkStart w:id="17" w:name="_Toc7373"/>
       <w:r>
         <w:rPr>
           <w:lang w:val="vi-VN"/>
         </w:rPr>
         <w:t>Mô hình ứng dụng web và nền tảng mã nguồn mở</w:t>
       </w:r>
-      <w:bookmarkEnd w:id="19"/>
+      <w:bookmarkEnd w:id="17"/>
     </w:p>
     <w:p>
       <w:pPr>
         <w:pStyle w:val="4"/>
         <w:ind w:left="1240" w:leftChars="0" w:firstLineChars="0"/>
       </w:pPr>
-      <w:bookmarkStart w:id="20" w:name="_Toc12398"/>
+      <w:bookmarkStart w:id="18" w:name="_Toc12398"/>
       <w:r>
         <w:rPr>
           <w:lang w:val="vi-VN"/>
         </w:rPr>
         <w:t>Mô hình client – server và giao thức HTTP</w:t>
       </w:r>
-      <w:bookmarkEnd w:id="20"/>
+      <w:bookmarkEnd w:id="18"/>
     </w:p>
     <w:p>
       <w:pPr>
@@ -13707,28 +12127,28 @@
       <w:r>
         <w:fldChar w:fldCharType="end"/>
       </w:r>
-      <w:bookmarkStart w:id="21" w:name="_Toc21369"/>
+      <w:bookmarkStart w:id="19" w:name="_Toc21369"/>
       <w:r>
         <w:rPr>
           <w:lang w:val="vi-VN"/>
         </w:rPr>
         <w:t>. Mô hình client – server của ứng dụng web</w:t>
       </w:r>
-      <w:bookmarkEnd w:id="21"/>
+      <w:bookmarkEnd w:id="19"/>
     </w:p>
     <w:p>
       <w:pPr>
         <w:pStyle w:val="4"/>
         <w:ind w:left="1240" w:leftChars="0" w:firstLineChars="0"/>
       </w:pPr>
-      <w:bookmarkStart w:id="22" w:name="_Toc30047"/>
+      <w:bookmarkStart w:id="20" w:name="_Toc30047"/>
       <w:r>
         <w:rPr>
           <w:lang w:val="vi-VN"/>
         </w:rPr>
         <w:t>Nền tảng mã nguồn mở PHP – Apache – MySQL</w:t>
       </w:r>
-      <w:bookmarkEnd w:id="22"/>
+      <w:bookmarkEnd w:id="20"/>
     </w:p>
     <w:p>
       <w:pPr>
@@ -13764,28 +12184,28 @@
       <w:pPr>
         <w:pStyle w:val="3"/>
       </w:pPr>
-      <w:bookmarkStart w:id="23" w:name="_Toc8388"/>
+      <w:bookmarkStart w:id="21" w:name="_Toc8388"/>
       <w:r>
         <w:rPr>
           <w:lang w:val="vi-VN"/>
         </w:rPr>
         <w:t>Ngôn ngữ lập trình PHP</w:t>
       </w:r>
-      <w:bookmarkEnd w:id="23"/>
+      <w:bookmarkEnd w:id="21"/>
     </w:p>
     <w:p>
       <w:pPr>
         <w:pStyle w:val="4"/>
         <w:ind w:left="1240" w:leftChars="0" w:firstLineChars="0"/>
       </w:pPr>
-      <w:bookmarkStart w:id="24" w:name="_Toc732"/>
+      <w:bookmarkStart w:id="22" w:name="_Toc732"/>
       <w:r>
         <w:rPr>
           <w:lang w:val="vi-VN"/>
         </w:rPr>
         <w:t>Cú pháp, tổ chức mã và biến môi trường</w:t>
       </w:r>
-      <w:bookmarkEnd w:id="24"/>
+      <w:bookmarkEnd w:id="22"/>
     </w:p>
     <w:p>
       <w:pPr>
@@ -14031,14 +12451,14 @@
         <w:pStyle w:val="4"/>
         <w:ind w:left="1240" w:leftChars="0" w:firstLineChars="0"/>
       </w:pPr>
-      <w:bookmarkStart w:id="25" w:name="_Toc30445"/>
+      <w:bookmarkStart w:id="23" w:name="_Toc30445"/>
       <w:r>
         <w:rPr>
           <w:lang w:val="vi-VN"/>
         </w:rPr>
         <w:t>Truy cập MySQL bằng MySQLi</w:t>
       </w:r>
-      <w:bookmarkEnd w:id="25"/>
+      <w:bookmarkEnd w:id="23"/>
     </w:p>
     <w:p>
       <w:pPr>
@@ -14090,14 +12510,14 @@
       <w:r>
         <w:fldChar w:fldCharType="end"/>
       </w:r>
-      <w:bookmarkStart w:id="26" w:name="_Toc28063"/>
+      <w:bookmarkStart w:id="24" w:name="_Toc28063"/>
       <w:r>
         <w:rPr>
           <w:lang w:val="vi-VN"/>
         </w:rPr>
         <w:t>. Các thành phần MySQLi được sử dụng</w:t>
       </w:r>
-      <w:bookmarkEnd w:id="26"/>
+      <w:bookmarkEnd w:id="24"/>
     </w:p>
     <w:tbl>
       <w:tblPr>
@@ -14796,14 +13216,14 @@
         <w:pStyle w:val="4"/>
         <w:ind w:left="1240" w:leftChars="0" w:firstLineChars="0"/>
       </w:pPr>
-      <w:bookmarkStart w:id="27" w:name="_Toc13858"/>
+      <w:bookmarkStart w:id="25" w:name="_Toc13858"/>
       <w:r>
         <w:rPr>
           <w:lang w:val="vi-VN"/>
         </w:rPr>
         <w:t>Xử lý biểu mẫu và tải tệp lên</w:t>
       </w:r>
-      <w:bookmarkEnd w:id="27"/>
+      <w:bookmarkEnd w:id="25"/>
     </w:p>
     <w:p>
       <w:pPr>
@@ -14884,28 +13304,28 @@
       <w:pPr>
         <w:pStyle w:val="3"/>
       </w:pPr>
-      <w:bookmarkStart w:id="28" w:name="_Toc9977"/>
+      <w:bookmarkStart w:id="26" w:name="_Toc9977"/>
       <w:r>
         <w:rPr>
           <w:lang w:val="vi-VN"/>
         </w:rPr>
         <w:t>Hệ quản trị cơ sở dữ liệu MySQL</w:t>
       </w:r>
-      <w:bookmarkEnd w:id="28"/>
+      <w:bookmarkEnd w:id="26"/>
     </w:p>
     <w:p>
       <w:pPr>
         <w:pStyle w:val="4"/>
         <w:ind w:left="1240" w:leftChars="0" w:firstLineChars="0"/>
       </w:pPr>
-      <w:bookmarkStart w:id="29" w:name="_Toc1792"/>
+      <w:bookmarkStart w:id="27" w:name="_Toc1792"/>
       <w:r>
         <w:rPr>
           <w:lang w:val="vi-VN"/>
         </w:rPr>
         <w:t>Mô hình quan hệ và các ràng buộc toàn vẹn</w:t>
       </w:r>
-      <w:bookmarkEnd w:id="29"/>
+      <w:bookmarkEnd w:id="27"/>
     </w:p>
     <w:p>
       <w:pPr>
@@ -15115,14 +13535,14 @@
         <w:pStyle w:val="4"/>
         <w:ind w:left="1240" w:leftChars="0" w:firstLineChars="0"/>
       </w:pPr>
-      <w:bookmarkStart w:id="30" w:name="_Toc21878"/>
+      <w:bookmarkStart w:id="28" w:name="_Toc21878"/>
       <w:r>
         <w:rPr>
           <w:lang w:val="vi-VN"/>
         </w:rPr>
         <w:t>Kiểu dữ liệu và bộ ký tự utf8mb4</w:t>
       </w:r>
-      <w:bookmarkEnd w:id="30"/>
+      <w:bookmarkEnd w:id="28"/>
     </w:p>
     <w:p>
       <w:pPr>
@@ -15249,14 +13669,14 @@
         <w:pStyle w:val="4"/>
         <w:ind w:left="1240" w:leftChars="0" w:firstLineChars="0"/>
       </w:pPr>
-      <w:bookmarkStart w:id="31" w:name="_Toc19423"/>
+      <w:bookmarkStart w:id="29" w:name="_Toc19423"/>
       <w:r>
         <w:rPr>
           <w:lang w:val="vi-VN"/>
         </w:rPr>
         <w:t>Truy vấn nhiều bảng, tìm kiếm và phân trang</w:t>
       </w:r>
-      <w:bookmarkEnd w:id="31"/>
+      <w:bookmarkEnd w:id="29"/>
     </w:p>
     <w:p>
       <w:pPr>
@@ -15423,6 +13843,12 @@
             <w:insideH w:val="single" w:color="auto" w:sz="4" w:space="0"/>
             <w:insideV w:val="single" w:color="auto" w:sz="4" w:space="0"/>
           </w:tblBorders>
+          <w:tblCellMar>
+            <w:top w:w="0" w:type="dxa"/>
+            <w:left w:w="108" w:type="dxa"/>
+            <w:bottom w:w="0" w:type="dxa"/>
+            <w:right w:w="108" w:type="dxa"/>
+          </w:tblCellMar>
         </w:tblPrEx>
         <w:tc>
           <w:tcPr>
@@ -15557,14 +13983,14 @@
         <w:pStyle w:val="4"/>
         <w:ind w:left="1240" w:leftChars="0" w:firstLineChars="0"/>
       </w:pPr>
-      <w:bookmarkStart w:id="32" w:name="_Toc31477"/>
+      <w:bookmarkStart w:id="30" w:name="_Toc31477"/>
       <w:r>
         <w:rPr>
           <w:lang w:val="vi-VN"/>
         </w:rPr>
         <w:t>Giao dịch (transaction) và khóa bản ghi</w:t>
       </w:r>
-      <w:bookmarkEnd w:id="32"/>
+      <w:bookmarkEnd w:id="30"/>
     </w:p>
     <w:p>
       <w:pPr>
@@ -15609,28 +14035,28 @@
       <w:pPr>
         <w:pStyle w:val="3"/>
       </w:pPr>
-      <w:bookmarkStart w:id="33" w:name="_Toc20398"/>
+      <w:bookmarkStart w:id="31" w:name="_Toc20398"/>
       <w:r>
         <w:rPr>
           <w:lang w:val="vi-VN"/>
         </w:rPr>
         <w:t>Container hóa với Docker và Docker Compose</w:t>
       </w:r>
-      <w:bookmarkEnd w:id="33"/>
+      <w:bookmarkEnd w:id="31"/>
     </w:p>
     <w:p>
       <w:pPr>
         <w:pStyle w:val="4"/>
         <w:ind w:left="1240" w:leftChars="0" w:firstLineChars="0"/>
       </w:pPr>
-      <w:bookmarkStart w:id="34" w:name="_Toc8386"/>
+      <w:bookmarkStart w:id="32" w:name="_Toc8386"/>
       <w:r>
         <w:rPr>
           <w:lang w:val="vi-VN"/>
         </w:rPr>
         <w:t>Khái niệm và các thành phần</w:t>
       </w:r>
-      <w:bookmarkEnd w:id="34"/>
+      <w:bookmarkEnd w:id="32"/>
     </w:p>
     <w:p>
       <w:pPr>
@@ -15967,28 +14393,28 @@
       <w:r>
         <w:fldChar w:fldCharType="end"/>
       </w:r>
-      <w:bookmarkStart w:id="35" w:name="_Toc17126"/>
+      <w:bookmarkStart w:id="33" w:name="_Toc17126"/>
       <w:r>
         <w:rPr>
           <w:lang w:val="vi-VN"/>
         </w:rPr>
         <w:t>. Mối quan hệ giữa hai container web và db trong Docker Compose</w:t>
       </w:r>
-      <w:bookmarkEnd w:id="35"/>
+      <w:bookmarkEnd w:id="33"/>
     </w:p>
     <w:p>
       <w:pPr>
         <w:pStyle w:val="4"/>
         <w:ind w:left="1240" w:leftChars="0" w:firstLineChars="0"/>
       </w:pPr>
-      <w:bookmarkStart w:id="36" w:name="_Toc8255"/>
+      <w:bookmarkStart w:id="34" w:name="_Toc8255"/>
       <w:r>
         <w:rPr>
           <w:lang w:val="vi-VN"/>
         </w:rPr>
         <w:t>WSL 2 và Docker Desktop trên Windows</w:t>
       </w:r>
-      <w:bookmarkEnd w:id="36"/>
+      <w:bookmarkEnd w:id="34"/>
     </w:p>
     <w:p>
       <w:pPr>
@@ -16024,14 +14450,14 @@
       <w:pPr>
         <w:pStyle w:val="3"/>
       </w:pPr>
-      <w:bookmarkStart w:id="37" w:name="_Toc26704"/>
+      <w:bookmarkStart w:id="35" w:name="_Toc26704"/>
       <w:r>
         <w:rPr>
           <w:lang w:val="vi-VN"/>
         </w:rPr>
         <w:t>Quản lý phiên bản với Git và GitHub</w:t>
       </w:r>
-      <w:bookmarkEnd w:id="37"/>
+      <w:bookmarkEnd w:id="35"/>
     </w:p>
     <w:p>
       <w:pPr>
@@ -16221,14 +14647,14 @@
       <w:pPr>
         <w:pStyle w:val="3"/>
       </w:pPr>
-      <w:bookmarkStart w:id="38" w:name="_Toc8309"/>
+      <w:bookmarkStart w:id="36" w:name="_Toc8309"/>
       <w:r>
         <w:rPr>
           <w:lang w:val="vi-VN"/>
         </w:rPr>
         <w:t>Xây dựng giao diện với HTML, CSS và Bootstrap</w:t>
       </w:r>
-      <w:bookmarkEnd w:id="38"/>
+      <w:bookmarkEnd w:id="36"/>
     </w:p>
     <w:p>
       <w:pPr>
@@ -16345,28 +14771,28 @@
       <w:pPr>
         <w:pStyle w:val="3"/>
       </w:pPr>
-      <w:bookmarkStart w:id="39" w:name="_Toc23343"/>
+      <w:bookmarkStart w:id="37" w:name="_Toc23343"/>
       <w:r>
         <w:rPr>
           <w:lang w:val="vi-VN"/>
         </w:rPr>
         <w:t>Quản lý phiên làm việc và xác thực người dùng</w:t>
       </w:r>
-      <w:bookmarkEnd w:id="39"/>
+      <w:bookmarkEnd w:id="37"/>
     </w:p>
     <w:p>
       <w:pPr>
         <w:pStyle w:val="4"/>
         <w:ind w:left="1240" w:leftChars="0" w:firstLineChars="0"/>
       </w:pPr>
-      <w:bookmarkStart w:id="40" w:name="_Toc1265"/>
+      <w:bookmarkStart w:id="38" w:name="_Toc1265"/>
       <w:r>
         <w:rPr>
           <w:lang w:val="vi-VN"/>
         </w:rPr>
         <w:t>PHP Session</w:t>
       </w:r>
-      <w:bookmarkEnd w:id="40"/>
+      <w:bookmarkEnd w:id="38"/>
     </w:p>
     <w:p>
       <w:pPr>
@@ -16412,14 +14838,14 @@
         <w:pStyle w:val="4"/>
         <w:ind w:left="1240" w:leftChars="0" w:firstLineChars="0"/>
       </w:pPr>
-      <w:bookmarkStart w:id="41" w:name="_Toc12167"/>
+      <w:bookmarkStart w:id="39" w:name="_Toc12167"/>
       <w:r>
         <w:rPr>
           <w:lang w:val="vi-VN"/>
         </w:rPr>
         <w:t>Băm mật khẩu và xác thực</w:t>
       </w:r>
-      <w:bookmarkEnd w:id="41"/>
+      <w:bookmarkEnd w:id="39"/>
     </w:p>
     <w:p>
       <w:pPr>
@@ -16509,14 +14935,14 @@
       <w:pPr>
         <w:pStyle w:val="3"/>
       </w:pPr>
-      <w:bookmarkStart w:id="42" w:name="_Toc22310"/>
+      <w:bookmarkStart w:id="40" w:name="_Toc22310"/>
       <w:r>
         <w:rPr>
           <w:lang w:val="vi-VN"/>
         </w:rPr>
         <w:t>Các nguyên tắc bảo mật ứng dụng web cơ bản</w:t>
       </w:r>
-      <w:bookmarkEnd w:id="42"/>
+      <w:bookmarkEnd w:id="40"/>
     </w:p>
     <w:p>
       <w:pPr>
@@ -16559,14 +14985,14 @@
       <w:r>
         <w:fldChar w:fldCharType="end"/>
       </w:r>
-      <w:bookmarkStart w:id="43" w:name="_Toc30949"/>
+      <w:bookmarkStart w:id="41" w:name="_Toc30949"/>
       <w:r>
         <w:rPr>
           <w:lang w:val="vi-VN"/>
         </w:rPr>
         <w:t>. Nguy cơ bảo mật và biện pháp áp dụng trong đồ án</w:t>
       </w:r>
-      <w:bookmarkEnd w:id="43"/>
+      <w:bookmarkEnd w:id="41"/>
     </w:p>
     <w:tbl>
       <w:tblPr>
@@ -17312,14 +15738,14 @@
       <w:pPr>
         <w:pStyle w:val="3"/>
       </w:pPr>
-      <w:bookmarkStart w:id="44" w:name="_Toc19803"/>
+      <w:bookmarkStart w:id="42" w:name="_Toc19803"/>
       <w:r>
         <w:rPr>
           <w:lang w:val="vi-VN"/>
         </w:rPr>
         <w:t>REST API, JSON và Fetch API</w:t>
       </w:r>
-      <w:bookmarkEnd w:id="44"/>
+      <w:bookmarkEnd w:id="42"/>
     </w:p>
     <w:p>
       <w:pPr>
@@ -17460,7 +15886,7 @@
         </w:numPr>
         <w:jc w:val="center"/>
       </w:pPr>
-      <w:bookmarkStart w:id="45" w:name="_Toc14834"/>
+      <w:bookmarkStart w:id="43" w:name="_Toc14834"/>
       <w:r>
         <w:rPr>
           <w:rFonts w:hint="default"/>
@@ -17468,20 +15894,20 @@
         </w:rPr>
         <w:t>THIẾT KẾ VÀ TRIỂN KHAI HỆ THỐNG</w:t>
       </w:r>
-      <w:bookmarkEnd w:id="45"/>
+      <w:bookmarkEnd w:id="43"/>
     </w:p>
     <w:p>
       <w:pPr>
         <w:pStyle w:val="3"/>
       </w:pPr>
-      <w:bookmarkStart w:id="46" w:name="_Toc824"/>
+      <w:bookmarkStart w:id="44" w:name="_Toc824"/>
       <w:r>
         <w:rPr>
           <w:lang w:val="vi-VN"/>
         </w:rPr>
         <w:t>Chuẩn bị môi trường phát triển</w:t>
       </w:r>
-      <w:bookmarkEnd w:id="46"/>
+      <w:bookmarkEnd w:id="44"/>
     </w:p>
     <w:p>
       <w:pPr>
@@ -17500,14 +15926,14 @@
         <w:pStyle w:val="4"/>
         <w:ind w:left="1240" w:leftChars="0" w:firstLineChars="0"/>
       </w:pPr>
-      <w:bookmarkStart w:id="47" w:name="_Toc17463"/>
+      <w:bookmarkStart w:id="45" w:name="_Toc17463"/>
       <w:r>
         <w:rPr>
           <w:lang w:val="vi-VN"/>
         </w:rPr>
         <w:t>Các thành phần cần chuẩn bị</w:t>
       </w:r>
-      <w:bookmarkEnd w:id="47"/>
+      <w:bookmarkEnd w:id="45"/>
     </w:p>
     <w:p>
       <w:pPr>
@@ -17538,14 +15964,14 @@
       <w:r>
         <w:fldChar w:fldCharType="end"/>
       </w:r>
-      <w:bookmarkStart w:id="48" w:name="_Toc2389"/>
+      <w:bookmarkStart w:id="46" w:name="_Toc2389"/>
       <w:r>
         <w:rPr>
           <w:lang w:val="vi-VN"/>
         </w:rPr>
         <w:t>. Các thành phần của môi trường phát triển</w:t>
       </w:r>
-      <w:bookmarkEnd w:id="48"/>
+      <w:bookmarkEnd w:id="46"/>
     </w:p>
     <w:tbl>
       <w:tblPr>
@@ -18132,14 +16558,14 @@
         <w:pStyle w:val="4"/>
         <w:ind w:left="1240" w:leftChars="0" w:firstLineChars="0"/>
       </w:pPr>
-      <w:bookmarkStart w:id="49" w:name="_Toc3314"/>
+      <w:bookmarkStart w:id="47" w:name="_Toc3314"/>
       <w:r>
         <w:rPr>
           <w:lang w:val="vi-VN"/>
         </w:rPr>
         <w:t>Kiểm tra cấu hình máy và cài đặt WSL 2</w:t>
       </w:r>
-      <w:bookmarkEnd w:id="49"/>
+      <w:bookmarkEnd w:id="47"/>
     </w:p>
     <w:p>
       <w:pPr>
@@ -18312,14 +16738,14 @@
         <w:pStyle w:val="4"/>
         <w:ind w:left="1240" w:leftChars="0" w:firstLineChars="0"/>
       </w:pPr>
-      <w:bookmarkStart w:id="50" w:name="_Toc10507"/>
+      <w:bookmarkStart w:id="48" w:name="_Toc10507"/>
       <w:r>
         <w:rPr>
           <w:lang w:val="vi-VN"/>
         </w:rPr>
         <w:t>Cài đặt Git, GitHub, Visual Studio Code và Docker Desktop</w:t>
       </w:r>
-      <w:bookmarkEnd w:id="50"/>
+      <w:bookmarkEnd w:id="48"/>
     </w:p>
     <w:p>
       <w:pPr>
@@ -18444,14 +16870,14 @@
         <w:pStyle w:val="4"/>
         <w:ind w:left="1240" w:leftChars="0" w:firstLineChars="0"/>
       </w:pPr>
-      <w:bookmarkStart w:id="51" w:name="_Toc26005"/>
+      <w:bookmarkStart w:id="49" w:name="_Toc26005"/>
       <w:r>
         <w:rPr>
           <w:lang w:val="vi-VN"/>
         </w:rPr>
         <w:t>Kiểm tra toàn bộ môi trường</w:t>
       </w:r>
-      <w:bookmarkEnd w:id="51"/>
+      <w:bookmarkEnd w:id="49"/>
     </w:p>
     <w:p>
       <w:pPr>
@@ -18927,28 +17353,28 @@
       <w:r>
         <w:fldChar w:fldCharType="end"/>
       </w:r>
-      <w:bookmarkStart w:id="52" w:name="_Toc2731"/>
+      <w:bookmarkStart w:id="50" w:name="_Toc2731"/>
       <w:r>
         <w:rPr>
           <w:lang w:val="vi-VN"/>
         </w:rPr>
         <w:t>. Kết quả kiểm tra môi trường bằng docker run --rm hello-world</w:t>
       </w:r>
-      <w:bookmarkEnd w:id="52"/>
+      <w:bookmarkEnd w:id="50"/>
     </w:p>
     <w:p>
       <w:pPr>
         <w:pStyle w:val="4"/>
         <w:ind w:left="1240" w:leftChars="0" w:firstLineChars="0"/>
       </w:pPr>
-      <w:bookmarkStart w:id="53" w:name="_Toc25193"/>
+      <w:bookmarkStart w:id="51" w:name="_Toc25193"/>
       <w:r>
         <w:rPr>
           <w:lang w:val="vi-VN"/>
         </w:rPr>
         <w:t>Xử lý lỗi thường gặp</w:t>
       </w:r>
-      <w:bookmarkEnd w:id="53"/>
+      <w:bookmarkEnd w:id="51"/>
     </w:p>
     <w:p>
       <w:pPr>
@@ -19038,14 +17464,14 @@
       <w:pPr>
         <w:pStyle w:val="3"/>
       </w:pPr>
-      <w:bookmarkStart w:id="54" w:name="_Toc26052"/>
+      <w:bookmarkStart w:id="52" w:name="_Toc26052"/>
       <w:r>
         <w:rPr>
           <w:lang w:val="vi-VN"/>
         </w:rPr>
         <w:t>Khởi tạo dự án PHP với Git/GitHub và Docker</w:t>
       </w:r>
-      <w:bookmarkEnd w:id="54"/>
+      <w:bookmarkEnd w:id="52"/>
     </w:p>
     <w:p>
       <w:pPr>
@@ -19064,14 +17490,14 @@
         <w:pStyle w:val="4"/>
         <w:ind w:left="1240" w:leftChars="0" w:firstLineChars="0"/>
       </w:pPr>
-      <w:bookmarkStart w:id="55" w:name="_Toc31387"/>
+      <w:bookmarkStart w:id="53" w:name="_Toc31387"/>
       <w:r>
         <w:rPr>
           <w:lang w:val="vi-VN"/>
         </w:rPr>
         <w:t>Tạo repository và clone về máy</w:t>
       </w:r>
-      <w:bookmarkEnd w:id="55"/>
+      <w:bookmarkEnd w:id="53"/>
     </w:p>
     <w:p>
       <w:pPr>
@@ -19216,14 +17642,14 @@
         <w:pStyle w:val="4"/>
         <w:ind w:left="1240" w:leftChars="0" w:firstLineChars="0"/>
       </w:pPr>
-      <w:bookmarkStart w:id="56" w:name="_Toc31251"/>
+      <w:bookmarkStart w:id="54" w:name="_Toc31251"/>
       <w:r>
         <w:rPr>
           <w:lang w:val="vi-VN"/>
         </w:rPr>
         <w:t>Tạo cấu trúc thư mục ban đầu</w:t>
       </w:r>
-      <w:bookmarkEnd w:id="56"/>
+      <w:bookmarkEnd w:id="54"/>
     </w:p>
     <w:p>
       <w:pPr>
@@ -19915,14 +18341,14 @@
         <w:pStyle w:val="4"/>
         <w:ind w:left="1240" w:leftChars="0" w:firstLineChars="0"/>
       </w:pPr>
-      <w:bookmarkStart w:id="57" w:name="_Toc12713"/>
+      <w:bookmarkStart w:id="55" w:name="_Toc12713"/>
       <w:r>
         <w:rPr>
           <w:lang w:val="vi-VN"/>
         </w:rPr>
         <w:t>Trang PHP đầu tiên</w:t>
       </w:r>
-      <w:bookmarkEnd w:id="57"/>
+      <w:bookmarkEnd w:id="55"/>
     </w:p>
     <w:p>
       <w:pPr>
@@ -19995,14 +18421,14 @@
         <w:pStyle w:val="4"/>
         <w:ind w:left="1240" w:leftChars="0" w:firstLineChars="0"/>
       </w:pPr>
-      <w:bookmarkStart w:id="58" w:name="_Toc22811"/>
+      <w:bookmarkStart w:id="56" w:name="_Toc22811"/>
       <w:r>
         <w:rPr>
           <w:lang w:val="vi-VN"/>
         </w:rPr>
         <w:t>Dockerfile và cấu hình Docker Compose</w:t>
       </w:r>
-      <w:bookmarkEnd w:id="58"/>
+      <w:bookmarkEnd w:id="56"/>
     </w:p>
     <w:p>
       <w:pPr>
@@ -20228,14 +18654,14 @@
         <w:pStyle w:val="4"/>
         <w:ind w:left="1240" w:leftChars="0" w:firstLineChars="0"/>
       </w:pPr>
-      <w:bookmarkStart w:id="59" w:name="_Toc26518"/>
+      <w:bookmarkStart w:id="57" w:name="_Toc26518"/>
       <w:r>
         <w:rPr>
           <w:lang w:val="vi-VN"/>
         </w:rPr>
         <w:t>Build, kiểm thử và lưu checkpoint đầu tiên</w:t>
       </w:r>
-      <w:bookmarkEnd w:id="59"/>
+      <w:bookmarkEnd w:id="57"/>
     </w:p>
     <w:p>
       <w:pPr>
@@ -20481,27 +18907,27 @@
       <w:r>
         <w:fldChar w:fldCharType="end"/>
       </w:r>
-      <w:bookmarkStart w:id="60" w:name="_Toc8619"/>
+      <w:bookmarkStart w:id="58" w:name="_Toc8619"/>
       <w:r>
         <w:rPr>
           <w:lang w:val="vi-VN"/>
         </w:rPr>
         <w:t>. Trang index.php đầu tiên chạy trên PHP 8.3 + Apache tại localhost:8080</w:t>
       </w:r>
-      <w:bookmarkEnd w:id="60"/>
+      <w:bookmarkEnd w:id="58"/>
     </w:p>
     <w:p>
       <w:pPr>
         <w:pStyle w:val="3"/>
       </w:pPr>
-      <w:bookmarkStart w:id="61" w:name="_Toc8034"/>
+      <w:bookmarkStart w:id="59" w:name="_Toc8034"/>
       <w:r>
         <w:rPr>
           <w:lang w:val="vi-VN"/>
         </w:rPr>
         <w:t>Thiết kế cơ sở dữ liệu</w:t>
       </w:r>
-      <w:bookmarkEnd w:id="61"/>
+      <w:bookmarkEnd w:id="59"/>
     </w:p>
     <w:p>
       <w:pPr>
@@ -20547,14 +18973,14 @@
         <w:pStyle w:val="4"/>
         <w:ind w:left="1240" w:leftChars="0" w:firstLineChars="0"/>
       </w:pPr>
-      <w:bookmarkStart w:id="62" w:name="_Toc14644"/>
+      <w:bookmarkStart w:id="60" w:name="_Toc14644"/>
       <w:r>
         <w:rPr>
           <w:lang w:val="vi-VN"/>
         </w:rPr>
         <w:t>Các thực thể và quan hệ</w:t>
       </w:r>
-      <w:bookmarkEnd w:id="62"/>
+      <w:bookmarkEnd w:id="60"/>
     </w:p>
     <w:p>
       <w:pPr>
@@ -20597,14 +19023,14 @@
       <w:r>
         <w:fldChar w:fldCharType="end"/>
       </w:r>
-      <w:bookmarkStart w:id="63" w:name="_Toc12993"/>
+      <w:bookmarkStart w:id="61" w:name="_Toc12993"/>
       <w:r>
         <w:rPr>
           <w:lang w:val="vi-VN"/>
         </w:rPr>
         <w:t>. Danh sách 9 bảng của cơ sở dữ liệu ql_banhang</w:t>
       </w:r>
-      <w:bookmarkEnd w:id="63"/>
+      <w:bookmarkEnd w:id="61"/>
     </w:p>
     <w:tbl>
       <w:tblPr>
@@ -21425,28 +19851,28 @@
       <w:r>
         <w:fldChar w:fldCharType="end"/>
       </w:r>
-      <w:bookmarkStart w:id="64" w:name="_Toc15053"/>
+      <w:bookmarkStart w:id="62" w:name="_Toc15053"/>
       <w:r>
         <w:rPr>
           <w:lang w:val="vi-VN"/>
         </w:rPr>
         <w:t>. Sơ đồ quan hệ thực thể (ERD) của cơ sở dữ liệu ql_banhang</w:t>
       </w:r>
-      <w:bookmarkEnd w:id="64"/>
+      <w:bookmarkEnd w:id="62"/>
     </w:p>
     <w:p>
       <w:pPr>
         <w:pStyle w:val="4"/>
         <w:ind w:left="1240" w:leftChars="0" w:firstLineChars="0"/>
       </w:pPr>
-      <w:bookmarkStart w:id="65" w:name="_Toc10059"/>
+      <w:bookmarkStart w:id="63" w:name="_Toc10059"/>
       <w:r>
         <w:rPr>
           <w:lang w:val="vi-VN"/>
         </w:rPr>
         <w:t>Thiết kế chi tiết các bảng chính</w:t>
       </w:r>
-      <w:bookmarkEnd w:id="65"/>
+      <w:bookmarkEnd w:id="63"/>
     </w:p>
     <w:p>
       <w:pPr>
@@ -21489,14 +19915,14 @@
       <w:r>
         <w:fldChar w:fldCharType="end"/>
       </w:r>
-      <w:bookmarkStart w:id="66" w:name="_Toc3947"/>
+      <w:bookmarkStart w:id="64" w:name="_Toc3947"/>
       <w:r>
         <w:rPr>
           <w:lang w:val="vi-VN"/>
         </w:rPr>
         <w:t>. Cấu trúc bảng products</w:t>
       </w:r>
-      <w:bookmarkEnd w:id="66"/>
+      <w:bookmarkEnd w:id="64"/>
     </w:p>
     <w:tbl>
       <w:tblPr>
@@ -22369,14 +20795,14 @@
       <w:r>
         <w:fldChar w:fldCharType="end"/>
       </w:r>
-      <w:bookmarkStart w:id="67" w:name="_Toc21162"/>
+      <w:bookmarkStart w:id="65" w:name="_Toc21162"/>
       <w:r>
         <w:rPr>
           <w:lang w:val="vi-VN"/>
         </w:rPr>
         <w:t>. Cấu trúc bảng product_images</w:t>
       </w:r>
-      <w:bookmarkEnd w:id="67"/>
+      <w:bookmarkEnd w:id="65"/>
     </w:p>
     <w:tbl>
       <w:tblPr>
@@ -23031,14 +21457,14 @@
       <w:r>
         <w:fldChar w:fldCharType="end"/>
       </w:r>
-      <w:bookmarkStart w:id="68" w:name="_Toc27048"/>
+      <w:bookmarkStart w:id="66" w:name="_Toc27048"/>
       <w:r>
         <w:rPr>
           <w:lang w:val="vi-VN"/>
         </w:rPr>
         <w:t>. Cấu trúc bảng customers</w:t>
       </w:r>
-      <w:bookmarkEnd w:id="68"/>
+      <w:bookmarkEnd w:id="66"/>
     </w:p>
     <w:tbl>
       <w:tblPr>
@@ -23619,14 +22045,14 @@
       <w:r>
         <w:fldChar w:fldCharType="end"/>
       </w:r>
-      <w:bookmarkStart w:id="69" w:name="_Toc25386"/>
+      <w:bookmarkStart w:id="67" w:name="_Toc25386"/>
       <w:r>
         <w:rPr>
           <w:lang w:val="vi-VN"/>
         </w:rPr>
         <w:t>. Cấu trúc bảng orders</w:t>
       </w:r>
-      <w:bookmarkEnd w:id="69"/>
+      <w:bookmarkEnd w:id="67"/>
     </w:p>
     <w:tbl>
       <w:tblPr>
@@ -24280,14 +22706,14 @@
       <w:r>
         <w:fldChar w:fldCharType="end"/>
       </w:r>
-      <w:bookmarkStart w:id="70" w:name="_Toc24194"/>
+      <w:bookmarkStart w:id="68" w:name="_Toc24194"/>
       <w:r>
         <w:rPr>
           <w:lang w:val="vi-VN"/>
         </w:rPr>
         <w:t>. Cấu trúc bảng orderdetail</w:t>
       </w:r>
-      <w:bookmarkEnd w:id="70"/>
+      <w:bookmarkEnd w:id="68"/>
     </w:p>
     <w:tbl>
       <w:tblPr>
@@ -24616,14 +23042,6 @@
       </w:tr>
       <w:tr>
         <w:tblPrEx>
-          <w:tblBorders>
-            <w:top w:val="single" w:color="000000" w:sz="4" w:space="0"/>
-            <w:left w:val="single" w:color="000000" w:sz="4" w:space="0"/>
-            <w:bottom w:val="single" w:color="000000" w:sz="4" w:space="0"/>
-            <w:right w:val="single" w:color="000000" w:sz="4" w:space="0"/>
-            <w:insideH w:val="single" w:color="000000" w:sz="4" w:space="0"/>
-            <w:insideV w:val="single" w:color="000000" w:sz="4" w:space="0"/>
-          </w:tblBorders>
           <w:tblCellMar>
             <w:top w:w="0" w:type="dxa"/>
             <w:left w:w="85" w:type="dxa"/>
@@ -24771,14 +23189,14 @@
         <w:pStyle w:val="4"/>
         <w:ind w:left="1240" w:leftChars="0" w:firstLineChars="0"/>
       </w:pPr>
-      <w:bookmarkStart w:id="71" w:name="_Toc27854"/>
+      <w:bookmarkStart w:id="69" w:name="_Toc27854"/>
       <w:r>
         <w:rPr>
           <w:lang w:val="vi-VN"/>
         </w:rPr>
         <w:t>Các quyết định thiết kế</w:t>
       </w:r>
-      <w:bookmarkEnd w:id="71"/>
+      <w:bookmarkEnd w:id="69"/>
     </w:p>
     <w:p>
       <w:pPr>
@@ -25068,14 +23486,14 @@
         <w:pStyle w:val="4"/>
         <w:ind w:left="1240" w:leftChars="0" w:firstLineChars="0"/>
       </w:pPr>
-      <w:bookmarkStart w:id="72" w:name="_Toc26018"/>
+      <w:bookmarkStart w:id="70" w:name="_Toc26018"/>
       <w:r>
         <w:rPr>
           <w:lang w:val="vi-VN"/>
         </w:rPr>
         <w:t>Dữ liệu mẫu</w:t>
       </w:r>
-      <w:bookmarkEnd w:id="72"/>
+      <w:bookmarkEnd w:id="70"/>
     </w:p>
     <w:p>
       <w:pPr>
@@ -25130,14 +23548,14 @@
         <w:pStyle w:val="4"/>
         <w:ind w:left="1240" w:leftChars="0" w:firstLineChars="0"/>
       </w:pPr>
-      <w:bookmarkStart w:id="73" w:name="_Toc29951"/>
+      <w:bookmarkStart w:id="71" w:name="_Toc29951"/>
       <w:r>
         <w:rPr>
           <w:lang w:val="vi-VN"/>
         </w:rPr>
         <w:t>Khởi tạo tự động bằng Docker Compose</w:t>
       </w:r>
-      <w:bookmarkEnd w:id="73"/>
+      <w:bookmarkEnd w:id="71"/>
     </w:p>
     <w:p>
       <w:pPr>
@@ -25719,12 +24137,6 @@
             <w:insideH w:val="single" w:color="auto" w:sz="4" w:space="0"/>
             <w:insideV w:val="single" w:color="auto" w:sz="4" w:space="0"/>
           </w:tblBorders>
-          <w:tblCellMar>
-            <w:top w:w="0" w:type="dxa"/>
-            <w:left w:w="108" w:type="dxa"/>
-            <w:bottom w:w="0" w:type="dxa"/>
-            <w:right w:w="108" w:type="dxa"/>
-          </w:tblCellMar>
         </w:tblPrEx>
         <w:tc>
           <w:tcPr>
@@ -26212,41 +24624,41 @@
       <w:r>
         <w:fldChar w:fldCharType="end"/>
       </w:r>
-      <w:bookmarkStart w:id="74" w:name="_Toc24309"/>
+      <w:bookmarkStart w:id="72" w:name="_Toc24309"/>
       <w:r>
         <w:rPr>
           <w:lang w:val="vi-VN"/>
         </w:rPr>
         <w:t>. Kết quả SHOW TABLES và dữ liệu mẫu trong cơ sở dữ liệu ql_banhang</w:t>
       </w:r>
-      <w:bookmarkEnd w:id="74"/>
+      <w:bookmarkEnd w:id="72"/>
     </w:p>
     <w:p>
       <w:pPr>
         <w:pStyle w:val="3"/>
       </w:pPr>
-      <w:bookmarkStart w:id="75" w:name="_Toc6026"/>
+      <w:bookmarkStart w:id="73" w:name="_Toc6026"/>
       <w:r>
         <w:rPr>
           <w:lang w:val="vi-VN"/>
         </w:rPr>
         <w:t>Kiến trúc ứng dụng và tổ chức mã nguồn</w:t>
       </w:r>
-      <w:bookmarkEnd w:id="75"/>
+      <w:bookmarkEnd w:id="73"/>
     </w:p>
     <w:p>
       <w:pPr>
         <w:pStyle w:val="4"/>
         <w:ind w:left="1240" w:leftChars="0" w:firstLineChars="0"/>
       </w:pPr>
-      <w:bookmarkStart w:id="76" w:name="_Toc17265"/>
+      <w:bookmarkStart w:id="74" w:name="_Toc17265"/>
       <w:r>
         <w:rPr>
           <w:lang w:val="vi-VN"/>
         </w:rPr>
         <w:t>Kiến trúc tổng thể</w:t>
       </w:r>
-      <w:bookmarkEnd w:id="76"/>
+      <w:bookmarkEnd w:id="74"/>
     </w:p>
     <w:p>
       <w:pPr>
@@ -26484,28 +24896,28 @@
       <w:r>
         <w:fldChar w:fldCharType="end"/>
       </w:r>
-      <w:bookmarkStart w:id="77" w:name="_Toc10081"/>
+      <w:bookmarkStart w:id="75" w:name="_Toc10081"/>
       <w:r>
         <w:rPr>
           <w:lang w:val="vi-VN"/>
         </w:rPr>
         <w:t>. Sơ đồ kiến trúc ba tầng của hệ thống quản lý bán hàng</w:t>
       </w:r>
-      <w:bookmarkEnd w:id="77"/>
+      <w:bookmarkEnd w:id="75"/>
     </w:p>
     <w:p>
       <w:pPr>
         <w:pStyle w:val="4"/>
         <w:ind w:left="1240" w:leftChars="0" w:firstLineChars="0"/>
       </w:pPr>
-      <w:bookmarkStart w:id="78" w:name="_Toc13524"/>
+      <w:bookmarkStart w:id="76" w:name="_Toc13524"/>
       <w:r>
         <w:rPr>
           <w:lang w:val="vi-VN"/>
         </w:rPr>
         <w:t>Tách thư mục public và src</w:t>
       </w:r>
-      <w:bookmarkEnd w:id="78"/>
+      <w:bookmarkEnd w:id="76"/>
     </w:p>
     <w:p>
       <w:pPr>
@@ -26587,14 +24999,14 @@
         <w:pStyle w:val="4"/>
         <w:ind w:left="1240" w:leftChars="0" w:firstLineChars="0"/>
       </w:pPr>
-      <w:bookmarkStart w:id="79" w:name="_Toc12886"/>
+      <w:bookmarkStart w:id="77" w:name="_Toc12886"/>
       <w:r>
         <w:rPr>
           <w:lang w:val="vi-VN"/>
         </w:rPr>
         <w:t>Kết nối cơ sở dữ liệu và cấu hình dùng chung</w:t>
       </w:r>
-      <w:bookmarkEnd w:id="79"/>
+      <w:bookmarkEnd w:id="77"/>
     </w:p>
     <w:p>
       <w:pPr>
@@ -27083,14 +25495,14 @@
         <w:pStyle w:val="4"/>
         <w:ind w:left="1240" w:leftChars="0" w:firstLineChars="0"/>
       </w:pPr>
-      <w:bookmarkStart w:id="80" w:name="_Toc29186"/>
+      <w:bookmarkStart w:id="78" w:name="_Toc29186"/>
       <w:r>
         <w:rPr>
           <w:lang w:val="vi-VN"/>
         </w:rPr>
         <w:t>Tổ chức khu vực Admin và Frontend</w:t>
       </w:r>
-      <w:bookmarkEnd w:id="80"/>
+      <w:bookmarkEnd w:id="78"/>
     </w:p>
     <w:p>
       <w:pPr>
@@ -27862,14 +26274,14 @@
       <w:r>
         <w:fldChar w:fldCharType="end"/>
       </w:r>
-      <w:bookmarkStart w:id="81" w:name="_Toc8049"/>
+      <w:bookmarkStart w:id="79" w:name="_Toc8049"/>
       <w:r>
         <w:rPr>
           <w:lang w:val="vi-VN"/>
         </w:rPr>
         <w:t>. Cấu trúc thư mục dự án php-mysql-sales trong Visual Studio Code</w:t>
       </w:r>
-      <w:bookmarkEnd w:id="81"/>
+      <w:bookmarkEnd w:id="79"/>
     </w:p>
     <w:p>
       <w:pPr>
@@ -27972,14 +26384,14 @@
         <w:pStyle w:val="4"/>
         <w:ind w:left="1240" w:leftChars="0" w:firstLineChars="0"/>
       </w:pPr>
-      <w:bookmarkStart w:id="82" w:name="_Toc17107"/>
+      <w:bookmarkStart w:id="80" w:name="_Toc17107"/>
       <w:r>
         <w:rPr>
           <w:lang w:val="vi-VN"/>
         </w:rPr>
         <w:t>Phân biệt URL chức năng và đường dẫn tài nguyên</w:t>
       </w:r>
-      <w:bookmarkEnd w:id="82"/>
+      <w:bookmarkEnd w:id="80"/>
     </w:p>
     <w:p>
       <w:pPr>
@@ -28042,14 +26454,14 @@
       <w:pPr>
         <w:pStyle w:val="3"/>
       </w:pPr>
-      <w:bookmarkStart w:id="83" w:name="_Toc14222"/>
+      <w:bookmarkStart w:id="81" w:name="_Toc14222"/>
       <w:r>
         <w:rPr>
           <w:lang w:val="vi-VN"/>
         </w:rPr>
         <w:t>Xây dựng phân hệ quản trị (Admin)</w:t>
       </w:r>
-      <w:bookmarkEnd w:id="83"/>
+      <w:bookmarkEnd w:id="81"/>
     </w:p>
     <w:p>
       <w:pPr>
@@ -28095,14 +26507,14 @@
         <w:pStyle w:val="4"/>
         <w:ind w:left="1240" w:leftChars="0" w:firstLineChars="0"/>
       </w:pPr>
-      <w:bookmarkStart w:id="84" w:name="_Toc8131"/>
+      <w:bookmarkStart w:id="82" w:name="_Toc8131"/>
       <w:r>
         <w:rPr>
           <w:lang w:val="vi-VN"/>
         </w:rPr>
         <w:t>Quản lý danh mục – CRUD</w:t>
       </w:r>
-      <w:bookmarkEnd w:id="84"/>
+      <w:bookmarkEnd w:id="82"/>
       <w:r>
         <w:rPr>
           <w:lang w:val="vi-VN"/>
@@ -29065,14 +27477,14 @@
       <w:r>
         <w:fldChar w:fldCharType="end"/>
       </w:r>
-      <w:bookmarkStart w:id="85" w:name="_Toc9436"/>
+      <w:bookmarkStart w:id="83" w:name="_Toc9436"/>
       <w:r>
         <w:rPr>
           <w:lang w:val="vi-VN"/>
         </w:rPr>
         <w:t>. Trang quản lý danh mục trong khu vực Admin</w:t>
       </w:r>
-      <w:bookmarkEnd w:id="85"/>
+      <w:bookmarkEnd w:id="83"/>
     </w:p>
     <w:p>
       <w:pPr>
@@ -29112,28 +27524,28 @@
       <w:r>
         <w:fldChar w:fldCharType="end"/>
       </w:r>
-      <w:bookmarkStart w:id="86" w:name="_Toc31701"/>
+      <w:bookmarkStart w:id="84" w:name="_Toc31701"/>
       <w:r>
         <w:rPr>
           <w:lang w:val="vi-VN"/>
         </w:rPr>
         <w:t>. Biểu mẫu thêm danh mục và thông báo lỗi khi bỏ trống tên</w:t>
       </w:r>
-      <w:bookmarkEnd w:id="86"/>
+      <w:bookmarkEnd w:id="84"/>
     </w:p>
     <w:p>
       <w:pPr>
         <w:pStyle w:val="4"/>
         <w:ind w:left="1240" w:leftChars="0" w:firstLineChars="0"/>
       </w:pPr>
-      <w:bookmarkStart w:id="87" w:name="_Toc24613"/>
+      <w:bookmarkStart w:id="85" w:name="_Toc24613"/>
       <w:r>
         <w:rPr>
           <w:lang w:val="vi-VN"/>
         </w:rPr>
         <w:t>Quản lý sản phẩm và dữ liệu quan hệ</w:t>
       </w:r>
-      <w:bookmarkEnd w:id="87"/>
+      <w:bookmarkEnd w:id="85"/>
     </w:p>
     <w:p>
       <w:pPr>
@@ -29532,14 +27944,14 @@
       <w:r>
         <w:fldChar w:fldCharType="end"/>
       </w:r>
-      <w:bookmarkStart w:id="88" w:name="_Toc26901"/>
+      <w:bookmarkStart w:id="86" w:name="_Toc26901"/>
       <w:r>
         <w:rPr>
           <w:lang w:val="vi-VN"/>
         </w:rPr>
         <w:t>. Danh sách sản phẩm trong khu vực Admin kèm ảnh chính</w:t>
       </w:r>
-      <w:bookmarkEnd w:id="88"/>
+      <w:bookmarkEnd w:id="86"/>
     </w:p>
     <w:p>
       <w:pPr>
@@ -29570,28 +27982,28 @@
       <w:r>
         <w:fldChar w:fldCharType="end"/>
       </w:r>
-      <w:bookmarkStart w:id="89" w:name="_Toc19730"/>
+      <w:bookmarkStart w:id="87" w:name="_Toc19730"/>
       <w:r>
         <w:rPr>
           <w:lang w:val="vi-VN"/>
         </w:rPr>
         <w:t>. Biểu mẫu thêm sản phẩm với danh sách thả xuống Danh mục và Nhà cung cấp</w:t>
       </w:r>
-      <w:bookmarkEnd w:id="89"/>
+      <w:bookmarkEnd w:id="87"/>
     </w:p>
     <w:p>
       <w:pPr>
         <w:pStyle w:val="4"/>
         <w:ind w:left="1240" w:leftChars="0" w:firstLineChars="0"/>
       </w:pPr>
-      <w:bookmarkStart w:id="90" w:name="_Toc3950"/>
+      <w:bookmarkStart w:id="88" w:name="_Toc3950"/>
       <w:r>
         <w:rPr>
           <w:lang w:val="vi-VN"/>
         </w:rPr>
         <w:t>Tải lên hình ảnh khi thêm sản phẩm</w:t>
       </w:r>
-      <w:bookmarkEnd w:id="90"/>
+      <w:bookmarkEnd w:id="88"/>
     </w:p>
     <w:p>
       <w:pPr>
@@ -30207,14 +28619,14 @@
       <w:r>
         <w:fldChar w:fldCharType="end"/>
       </w:r>
-      <w:bookmarkStart w:id="91" w:name="_Toc21018"/>
+      <w:bookmarkStart w:id="89" w:name="_Toc21018"/>
       <w:r>
         <w:rPr>
           <w:lang w:val="vi-VN"/>
         </w:rPr>
         <w:t>. Biểu mẫu thêm sản phẩm với bốn ảnh và kết quả lưu trong bảng product_images</w:t>
       </w:r>
-      <w:bookmarkEnd w:id="91"/>
+      <w:bookmarkEnd w:id="89"/>
     </w:p>
     <w:p>
       <w:pPr>
@@ -30243,7 +28655,7 @@
         </w:numPr>
         <w:jc w:val="center"/>
       </w:pPr>
-      <w:bookmarkStart w:id="92" w:name="_Toc24051"/>
+      <w:bookmarkStart w:id="90" w:name="_Toc24051"/>
       <w:r>
         <w:rPr>
           <w:rFonts w:hint="default"/>
@@ -30251,7 +28663,7 @@
         </w:rPr>
         <w:t>KẾT QUẢ THỰC HIỆN VÀ KIỂM THỬ</w:t>
       </w:r>
-      <w:bookmarkEnd w:id="92"/>
+      <w:bookmarkEnd w:id="90"/>
     </w:p>
     <w:p>
       <w:pPr>
@@ -30280,7 +28692,7 @@
         </w:numPr>
         <w:jc w:val="center"/>
       </w:pPr>
-      <w:bookmarkStart w:id="93" w:name="_Toc5169"/>
+      <w:bookmarkStart w:id="91" w:name="_Toc5169"/>
       <w:r>
         <w:t>KẾT LUẬN</w:t>
       </w:r>
@@ -30291,7 +28703,7 @@
         </w:rPr>
         <w:t xml:space="preserve"> VÀ HƯỚNG PHÁT TRIỂN</w:t>
       </w:r>
-      <w:bookmarkEnd w:id="93"/>
+      <w:bookmarkEnd w:id="91"/>
     </w:p>
     <w:p>
       <w:r>
@@ -30303,11 +28715,11 @@
         <w:pStyle w:val="22"/>
         <w:outlineLvl w:val="0"/>
       </w:pPr>
-      <w:bookmarkStart w:id="94" w:name="_Toc10049"/>
+      <w:bookmarkStart w:id="92" w:name="_Toc10049"/>
       <w:r>
         <w:t>TÀI LIỆU THAM KHẢO</w:t>
       </w:r>
-      <w:bookmarkEnd w:id="94"/>
+      <w:bookmarkEnd w:id="92"/>
     </w:p>
     <w:p>
       <w:pPr>
@@ -30330,11 +28742,11 @@
         <w:pStyle w:val="22"/>
         <w:outlineLvl w:val="0"/>
       </w:pPr>
-      <w:bookmarkStart w:id="95" w:name="_Toc15144"/>
+      <w:bookmarkStart w:id="93" w:name="_Toc15144"/>
       <w:r>
         <w:t>PHỤ LỤC</w:t>
       </w:r>
-      <w:bookmarkEnd w:id="95"/>
+      <w:bookmarkEnd w:id="93"/>
     </w:p>
     <w:p>
       <w:r>
@@ -33109,8 +31521,8 @@
     <w:lsdException w:uiPriority="99" w:name="index 8"/>
     <w:lsdException w:uiPriority="99" w:name="index 9"/>
     <w:lsdException w:qFormat="1" w:uiPriority="39" w:name="toc 1"/>
-    <w:lsdException w:uiPriority="39" w:semiHidden="0" w:name="toc 2"/>
-    <w:lsdException w:uiPriority="39" w:semiHidden="0" w:name="toc 3"/>
+    <w:lsdException w:qFormat="1" w:uiPriority="39" w:semiHidden="0" w:name="toc 2"/>
+    <w:lsdException w:qFormat="1" w:uiPriority="39" w:semiHidden="0" w:name="toc 3"/>
     <w:lsdException w:uiPriority="39" w:name="toc 4"/>
     <w:lsdException w:uiPriority="39" w:name="toc 5"/>
     <w:lsdException w:uiPriority="39" w:name="toc 6"/>
@@ -33121,10 +31533,10 @@
     <w:lsdException w:uiPriority="99" w:name="footnote text"/>
     <w:lsdException w:uiPriority="99" w:name="annotation text"/>
     <w:lsdException w:qFormat="1" w:uiPriority="99" w:semiHidden="0" w:name="header"/>
-    <w:lsdException w:uiPriority="99" w:semiHidden="0" w:name="footer"/>
+    <w:lsdException w:qFormat="1" w:uiPriority="99" w:semiHidden="0" w:name="footer"/>
     <w:lsdException w:uiPriority="99" w:name="index heading"/>
     <w:lsdException w:qFormat="1" w:uiPriority="35" w:name="caption"/>
-    <w:lsdException w:uiPriority="99" w:semiHidden="0" w:name="table of figures"/>
+    <w:lsdException w:qFormat="1" w:uiPriority="99" w:semiHidden="0" w:name="table of figures"/>
     <w:lsdException w:uiPriority="99" w:name="envelope address"/>
     <w:lsdException w:uiPriority="99" w:name="envelope return"/>
     <w:lsdException w:uiPriority="99" w:name="footnote reference"/>
@@ -33192,7 +31604,7 @@
     <w:lsdException w:uiPriority="99" w:name="HTML Sample"/>
     <w:lsdException w:uiPriority="99" w:name="HTML Typewriter"/>
     <w:lsdException w:uiPriority="99" w:name="HTML Variable"/>
-    <w:lsdException w:uiPriority="99" w:name="Normal Table"/>
+    <w:lsdException w:qFormat="1" w:uiPriority="99" w:name="Normal Table"/>
     <w:lsdException w:uiPriority="99" w:name="annotation subject"/>
     <w:lsdException w:uiPriority="99" w:name="Table Simple 1"/>
     <w:lsdException w:uiPriority="99" w:name="Table Simple 2"/>
@@ -33237,7 +31649,7 @@
     <w:lsdException w:uiPriority="99" w:name="Table Web 2"/>
     <w:lsdException w:uiPriority="99" w:name="Table Web 3"/>
     <w:lsdException w:uiPriority="99" w:name="Balloon Text"/>
-    <w:lsdException w:unhideWhenUsed="0" w:uiPriority="39" w:semiHidden="0" w:name="Table Grid"/>
+    <w:lsdException w:qFormat="1" w:unhideWhenUsed="0" w:uiPriority="39" w:semiHidden="0" w:name="Table Grid"/>
     <w:lsdException w:uiPriority="99" w:name="Table Theme"/>
     <w:lsdException w:unhideWhenUsed="0" w:uiPriority="60" w:semiHidden="0" w:name="Light Shading"/>
     <w:lsdException w:unhideWhenUsed="0" w:uiPriority="61" w:semiHidden="0" w:name="Light List"/>
@@ -33614,6 +32026,7 @@
     <w:name w:val="Normal Table"/>
     <w:semiHidden/>
     <w:unhideWhenUsed/>
+    <w:qFormat/>
     <w:uiPriority w:val="99"/>
     <w:tblPr>
       <w:tblCellMar>
@@ -33629,6 +32042,7 @@
     <w:basedOn w:val="1"/>
     <w:link w:val="21"/>
     <w:unhideWhenUsed/>
+    <w:qFormat/>
     <w:uiPriority w:val="99"/>
     <w:pPr>
       <w:tabs>
@@ -33656,6 +32070,7 @@
   <w:style w:type="table" w:styleId="15">
     <w:name w:val="Table Grid"/>
     <w:basedOn w:val="12"/>
+    <w:qFormat/>
     <w:uiPriority w:val="39"/>
     <w:pPr>
       <w:widowControl w:val="0"/>
@@ -33677,6 +32092,7 @@
     <w:basedOn w:val="1"/>
     <w:next w:val="1"/>
     <w:unhideWhenUsed/>
+    <w:qFormat/>
     <w:uiPriority w:val="99"/>
   </w:style>
   <w:style w:type="paragraph" w:styleId="17">
@@ -33698,6 +32114,7 @@
     <w:next w:val="1"/>
     <w:autoRedefine/>
     <w:unhideWhenUsed/>
+    <w:qFormat/>
     <w:uiPriority w:val="39"/>
     <w:pPr>
       <w:spacing w:after="100"/>
@@ -33710,6 +32127,7 @@
     <w:next w:val="1"/>
     <w:autoRedefine/>
     <w:unhideWhenUsed/>
+    <w:qFormat/>
     <w:uiPriority w:val="39"/>
     <w:pPr>
       <w:spacing w:after="100"/>
@@ -33786,6 +32204,7 @@
     <w:basedOn w:val="11"/>
     <w:link w:val="4"/>
     <w:semiHidden/>
+    <w:qFormat/>
     <w:uiPriority w:val="9"/>
     <w:rPr>
       <w:rFonts w:asciiTheme="majorHAnsi" w:hAnsiTheme="majorHAnsi" w:eastAsiaTheme="majorEastAsia" w:cstheme="majorBidi"/>
@@ -33799,6 +32218,7 @@
     <w:basedOn w:val="11"/>
     <w:link w:val="5"/>
     <w:semiHidden/>
+    <w:qFormat/>
     <w:uiPriority w:val="9"/>
     <w:rPr>
       <w:rFonts w:asciiTheme="majorHAnsi" w:hAnsiTheme="majorHAnsi" w:eastAsiaTheme="majorEastAsia" w:cstheme="majorBidi"/>
@@ -33824,6 +32244,7 @@
     <w:basedOn w:val="11"/>
     <w:link w:val="7"/>
     <w:semiHidden/>
+    <w:qFormat/>
     <w:uiPriority w:val="9"/>
     <w:rPr>
       <w:rFonts w:asciiTheme="majorHAnsi" w:hAnsiTheme="majorHAnsi" w:eastAsiaTheme="majorEastAsia" w:cstheme="majorBidi"/>
@@ -33835,6 +32256,7 @@
     <w:basedOn w:val="11"/>
     <w:link w:val="8"/>
     <w:semiHidden/>
+    <w:qFormat/>
     <w:uiPriority w:val="9"/>
     <w:rPr>
       <w:rFonts w:asciiTheme="majorHAnsi" w:hAnsiTheme="majorHAnsi" w:eastAsiaTheme="majorEastAsia" w:cstheme="majorBidi"/>
@@ -33848,6 +32270,7 @@
     <w:basedOn w:val="11"/>
     <w:link w:val="9"/>
     <w:semiHidden/>
+    <w:qFormat/>
     <w:uiPriority w:val="9"/>
     <w:rPr>
       <w:rFonts w:asciiTheme="majorHAnsi" w:hAnsiTheme="majorHAnsi" w:eastAsiaTheme="majorEastAsia" w:cstheme="majorBidi"/>
@@ -33869,6 +32292,7 @@
     <w:basedOn w:val="11"/>
     <w:link w:val="10"/>
     <w:semiHidden/>
+    <w:qFormat/>
     <w:uiPriority w:val="9"/>
     <w:rPr>
       <w:rFonts w:asciiTheme="majorHAnsi" w:hAnsiTheme="majorHAnsi" w:eastAsiaTheme="majorEastAsia" w:cstheme="majorBidi"/>
@@ -33931,6 +32355,7 @@
   <w:style w:type="paragraph" w:customStyle="1" w:styleId="35">
     <w:name w:val="Hinh-Bang"/>
     <w:basedOn w:val="1"/>
+    <w:qFormat/>
     <w:uiPriority w:val="0"/>
     <w:pPr>
       <w:keepNext/>

</xml_diff>

<commit_message>
Cập nhật đặt hàng và quản lý đơn hàng
</commit_message>
<xml_diff>
--- a/Baocao/qt_baocao_110123032_DinhHuuNhan_DA23TTA.docx
+++ b/Baocao/qt_baocao_110123032_DinhHuuNhan_DA23TTA.docx
@@ -9372,15 +9372,7 @@
         <w:rPr>
           <w:lang w:val="vi-VN"/>
         </w:rPr>
-        <w:t>Từ bài toán trên, đồ án xác định các ngh</w:t>
-      </w:r>
-      <w:bookmarkStart w:id="94" w:name="_GoBack"/>
-      <w:bookmarkEnd w:id="94"/>
-      <w:r>
-        <w:rPr>
-          <w:lang w:val="vi-VN"/>
-        </w:rPr>
-        <w:t>iệp vụ cốt lõi và ánh xạ chúng vào các thực thể dữ liệu như trong Bảng 1.1.</w:t>
+        <w:t>Từ bài toán trên, đồ án xác định các nghiệp vụ cốt lõi và ánh xạ chúng vào các thực thể dữ liệu như trong Bảng 1.1.</w:t>
       </w:r>
     </w:p>
     <w:p>
@@ -11846,45 +11838,6 @@
         <w:pStyle w:val="35"/>
         <w:bidi w:val="0"/>
       </w:pPr>
-      <w:r>
-        <w:drawing>
-          <wp:inline distT="0" distB="0" distL="0" distR="0">
-            <wp:extent cx="4895850" cy="3182620"/>
-            <wp:effectExtent l="0" t="0" r="11430" b="2540"/>
-            <wp:docPr id="100" name="Hình 100" descr="Sơ đồ tổng quan: người dùng và quản trị viên tương tác với ba khu vực của hệ thống, hệ thống làm việc với cơ sở dữ liệu MySQL và kho ảnh thiết bị"/>
-            <wp:cNvGraphicFramePr>
-              <a:graphicFrameLocks xmlns:a="http://schemas.openxmlformats.org/drawingml/2006/main" noChangeAspect="1"/>
-            </wp:cNvGraphicFramePr>
-            <a:graphic xmlns:a="http://schemas.openxmlformats.org/drawingml/2006/main">
-              <a:graphicData uri="http://schemas.openxmlformats.org/drawingml/2006/picture">
-                <pic:pic xmlns:pic="http://schemas.openxmlformats.org/drawingml/2006/picture">
-                  <pic:nvPicPr>
-                    <pic:cNvPr id="100" name="Hình 100" descr="Sơ đồ tổng quan: người dùng và quản trị viên tương tác với ba khu vực của hệ thống, hệ thống làm việc với cơ sở dữ liệu MySQL và kho ảnh thiết bị"/>
-                    <pic:cNvPicPr>
-                      <a:picLocks noChangeAspect="1"/>
-                    </pic:cNvPicPr>
-                  </pic:nvPicPr>
-                  <pic:blipFill>
-                    <a:blip r:embed="rId9"/>
-                    <a:stretch>
-                      <a:fillRect/>
-                    </a:stretch>
-                  </pic:blipFill>
-                  <pic:spPr>
-                    <a:xfrm>
-                      <a:off x="0" y="0"/>
-                      <a:ext cx="4896000" cy="3182753"/>
-                    </a:xfrm>
-                    <a:prstGeom prst="rect">
-                      <a:avLst/>
-                    </a:prstGeom>
-                  </pic:spPr>
-                </pic:pic>
-              </a:graphicData>
-            </a:graphic>
-          </wp:inline>
-        </w:drawing>
-      </w:r>
     </w:p>
     <w:p>
       <w:pPr>
@@ -12097,6 +12050,8 @@
           <w:lang w:val="vi-VN"/>
         </w:rPr>
       </w:pPr>
+      <w:bookmarkStart w:id="94" w:name="_GoBack"/>
+      <w:bookmarkEnd w:id="94"/>
     </w:p>
     <w:p>
       <w:pPr>
@@ -21647,14 +21602,6 @@
       </w:tr>
       <w:tr>
         <w:tblPrEx>
-          <w:tblBorders>
-            <w:top w:val="single" w:color="000000" w:sz="4" w:space="0"/>
-            <w:left w:val="single" w:color="000000" w:sz="4" w:space="0"/>
-            <w:bottom w:val="single" w:color="000000" w:sz="4" w:space="0"/>
-            <w:right w:val="single" w:color="000000" w:sz="4" w:space="0"/>
-            <w:insideH w:val="single" w:color="000000" w:sz="4" w:space="0"/>
-            <w:insideV w:val="single" w:color="000000" w:sz="4" w:space="0"/>
-          </w:tblBorders>
           <w:tblCellMar>
             <w:top w:w="0" w:type="dxa"/>
             <w:left w:w="85" w:type="dxa"/>
@@ -21793,14 +21740,6 @@
       </w:tr>
       <w:tr>
         <w:tblPrEx>
-          <w:tblBorders>
-            <w:top w:val="single" w:color="000000" w:sz="4" w:space="0"/>
-            <w:left w:val="single" w:color="000000" w:sz="4" w:space="0"/>
-            <w:bottom w:val="single" w:color="000000" w:sz="4" w:space="0"/>
-            <w:right w:val="single" w:color="000000" w:sz="4" w:space="0"/>
-            <w:insideH w:val="single" w:color="000000" w:sz="4" w:space="0"/>
-            <w:insideV w:val="single" w:color="000000" w:sz="4" w:space="0"/>
-          </w:tblBorders>
           <w:tblCellMar>
             <w:top w:w="0" w:type="dxa"/>
             <w:left w:w="85" w:type="dxa"/>
@@ -21939,14 +21878,6 @@
       </w:tr>
       <w:tr>
         <w:tblPrEx>
-          <w:tblBorders>
-            <w:top w:val="single" w:color="000000" w:sz="4" w:space="0"/>
-            <w:left w:val="single" w:color="000000" w:sz="4" w:space="0"/>
-            <w:bottom w:val="single" w:color="000000" w:sz="4" w:space="0"/>
-            <w:right w:val="single" w:color="000000" w:sz="4" w:space="0"/>
-            <w:insideH w:val="single" w:color="000000" w:sz="4" w:space="0"/>
-            <w:insideV w:val="single" w:color="000000" w:sz="4" w:space="0"/>
-          </w:tblBorders>
           <w:tblCellMar>
             <w:top w:w="0" w:type="dxa"/>
             <w:left w:w="85" w:type="dxa"/>
@@ -23042,6 +22973,14 @@
       </w:tr>
       <w:tr>
         <w:tblPrEx>
+          <w:tblBorders>
+            <w:top w:val="single" w:color="000000" w:sz="4" w:space="0"/>
+            <w:left w:val="single" w:color="000000" w:sz="4" w:space="0"/>
+            <w:bottom w:val="single" w:color="000000" w:sz="4" w:space="0"/>
+            <w:right w:val="single" w:color="000000" w:sz="4" w:space="0"/>
+            <w:insideH w:val="single" w:color="000000" w:sz="4" w:space="0"/>
+            <w:insideV w:val="single" w:color="000000" w:sz="4" w:space="0"/>
+          </w:tblBorders>
           <w:tblCellMar>
             <w:top w:w="0" w:type="dxa"/>
             <w:left w:w="85" w:type="dxa"/>
@@ -24137,6 +24076,12 @@
             <w:insideH w:val="single" w:color="auto" w:sz="4" w:space="0"/>
             <w:insideV w:val="single" w:color="auto" w:sz="4" w:space="0"/>
           </w:tblBorders>
+          <w:tblCellMar>
+            <w:top w:w="0" w:type="dxa"/>
+            <w:left w:w="108" w:type="dxa"/>
+            <w:bottom w:w="0" w:type="dxa"/>
+            <w:right w:w="108" w:type="dxa"/>
+          </w:tblCellMar>
         </w:tblPrEx>
         <w:tc>
           <w:tcPr>

</xml_diff>